<commit_message>
docs(qlda): remove deleted commit from git report and synchronize documents
</commit_message>
<xml_diff>
--- a/Chuong07_Git.docx
+++ b/Chuong07_Git.docx
@@ -7466,7 +7466,7 @@
                 <w:b/>
                 <w:sz w:val="22"/>
               </w:rPr>
-              <w:t>7eebd69</w:t>
+              <w:t>218ee9d</w:t>
             </w:r>
           </w:p>
         </w:tc>
@@ -7504,7 +7504,7 @@
                 <w:rFonts w:ascii="Consolas" w:hAnsi="Consolas"/>
                 <w:sz w:val="20"/>
               </w:rPr>
-              <w:t>docs/final-report</w:t>
+              <w:t>main</w:t>
             </w:r>
           </w:p>
         </w:tc>
@@ -7523,26 +7523,7 @@
                 <w:rFonts w:ascii="Times New Roman" w:hAnsi="Times New Roman"/>
                 <w:sz w:val="22"/>
               </w:rPr>
-              <w:t>BapTruongSinh</w:t>
-            </w:r>
-          </w:p>
-        </w:tc>
-        <w:tc>
-          <w:tcPr>
-            <w:tcW w:type="dxa" w:w="1656"/>
-          </w:tcPr>
-          <w:p>
-            <w:pPr>
-              <w:spacing w:before="60" w:after="60"/>
-              <w:jc w:val="left"/>
-            </w:pPr>
-            <w:r/>
-            <w:r>
-              <w:rPr>
-                <w:rFonts w:ascii="Consolas" w:hAnsi="Consolas"/>
-                <w:sz w:val="20"/>
-              </w:rPr>
-              <w:t>docs(report): complete chapter 7 git and control algorithm documentation</w:t>
+              <w:t>MinhTris</w:t>
             </w:r>
           </w:p>
         </w:tc>
@@ -7561,7 +7542,26 @@
                 <w:rFonts w:ascii="Times New Roman" w:hAnsi="Times New Roman"/>
                 <w:sz w:val="22"/>
               </w:rPr>
-              <w:t>WBS 9.2 - 9.3</w:t>
+              <w:t>*Merge branch 'docs/final-report' into main*</w:t>
+            </w:r>
+          </w:p>
+        </w:tc>
+        <w:tc>
+          <w:tcPr>
+            <w:tcW w:type="dxa" w:w="1656"/>
+          </w:tcPr>
+          <w:p>
+            <w:pPr>
+              <w:spacing w:before="60" w:after="60"/>
+              <w:jc w:val="left"/>
+            </w:pPr>
+            <w:r/>
+            <w:r>
+              <w:rPr>
+                <w:rFonts w:ascii="Times New Roman" w:hAnsi="Times New Roman"/>
+                <w:sz w:val="22"/>
+              </w:rPr>
+              <w:t>Tích hợp báo cáo hoàn chỉnh</w:t>
             </w:r>
           </w:p>
         </w:tc>
@@ -7583,7 +7583,7 @@
                 <w:b/>
                 <w:sz w:val="22"/>
               </w:rPr>
-              <w:t>6922e9a</w:t>
+              <w:t>5409d70</w:t>
             </w:r>
           </w:p>
         </w:tc>
@@ -7602,7 +7602,7 @@
                 <w:rFonts w:ascii="Times New Roman" w:hAnsi="Times New Roman"/>
                 <w:sz w:val="22"/>
               </w:rPr>
-              <w:t>08/05/2026</w:t>
+              <w:t>09/05/2026</w:t>
             </w:r>
           </w:p>
         </w:tc>
@@ -7656,29 +7656,29 @@
             <w:r/>
             <w:r>
               <w:rPr>
+                <w:rFonts w:ascii="Consolas" w:hAnsi="Consolas"/>
+                <w:sz w:val="20"/>
+              </w:rPr>
+              <w:t>docs(presentation): compile presentation slide for final defense</w:t>
+            </w:r>
+          </w:p>
+        </w:tc>
+        <w:tc>
+          <w:tcPr>
+            <w:tcW w:type="dxa" w:w="1656"/>
+          </w:tcPr>
+          <w:p>
+            <w:pPr>
+              <w:spacing w:before="60" w:after="60"/>
+              <w:jc w:val="left"/>
+            </w:pPr>
+            <w:r/>
+            <w:r>
+              <w:rPr>
                 <w:rFonts w:ascii="Times New Roman" w:hAnsi="Times New Roman"/>
                 <w:sz w:val="22"/>
               </w:rPr>
-              <w:t>*Merge branch 'docs/final-report' into main*</w:t>
-            </w:r>
-          </w:p>
-        </w:tc>
-        <w:tc>
-          <w:tcPr>
-            <w:tcW w:type="dxa" w:w="1656"/>
-          </w:tcPr>
-          <w:p>
-            <w:pPr>
-              <w:spacing w:before="60" w:after="60"/>
-              <w:jc w:val="left"/>
-            </w:pPr>
-            <w:r/>
-            <w:r>
-              <w:rPr>
-                <w:rFonts w:ascii="Times New Roman" w:hAnsi="Times New Roman"/>
-                <w:sz w:val="22"/>
-              </w:rPr>
-              <w:t>Tích hợp báo cáo hoàn chỉnh</w:t>
+              <w:t>WBS 9.4</w:t>
             </w:r>
           </w:p>
         </w:tc>
@@ -7700,7 +7700,7 @@
                 <w:b/>
                 <w:sz w:val="22"/>
               </w:rPr>
-              <w:t>351525f</w:t>
+              <w:t>Tag `v1.0-final`</w:t>
             </w:r>
           </w:p>
         </w:tc>
@@ -7773,29 +7773,43 @@
             <w:r/>
             <w:r>
               <w:rPr>
+                <w:rFonts w:ascii="Times New Roman" w:hAnsi="Times New Roman"/>
+                <w:sz w:val="22"/>
+              </w:rPr>
+              <w:t xml:space="preserve">*Gắn thẻ tag </w:t>
+            </w:r>
+            <w:r>
+              <w:rPr>
                 <w:rFonts w:ascii="Consolas" w:hAnsi="Consolas"/>
                 <w:sz w:val="20"/>
               </w:rPr>
-              <w:t>docs(presentation): compile presentation slide for final defense</w:t>
-            </w:r>
-          </w:p>
-        </w:tc>
-        <w:tc>
-          <w:tcPr>
-            <w:tcW w:type="dxa" w:w="1656"/>
-          </w:tcPr>
-          <w:p>
-            <w:pPr>
-              <w:spacing w:before="60" w:after="60"/>
-              <w:jc w:val="left"/>
-            </w:pPr>
-            <w:r/>
+              <w:t>v1.0-final</w:t>
+            </w:r>
             <w:r>
               <w:rPr>
                 <w:rFonts w:ascii="Times New Roman" w:hAnsi="Times New Roman"/>
                 <w:sz w:val="22"/>
               </w:rPr>
-              <w:t>WBS 9.4</w:t>
+              <w:t xml:space="preserve"> tại phiên bản hoàn thiện nộp báo cáo*</w:t>
+            </w:r>
+          </w:p>
+        </w:tc>
+        <w:tc>
+          <w:tcPr>
+            <w:tcW w:type="dxa" w:w="1656"/>
+          </w:tcPr>
+          <w:p>
+            <w:pPr>
+              <w:spacing w:before="60" w:after="60"/>
+              <w:jc w:val="left"/>
+            </w:pPr>
+            <w:r/>
+            <w:r>
+              <w:rPr>
+                <w:rFonts w:ascii="Times New Roman" w:hAnsi="Times New Roman"/>
+                <w:sz w:val="22"/>
+              </w:rPr>
+              <w:t>Chuyển giao đồ án</w:t>
             </w:r>
           </w:p>
         </w:tc>
@@ -7817,7 +7831,7 @@
                 <w:b/>
                 <w:sz w:val="22"/>
               </w:rPr>
-              <w:t>Tag `v1.0-final`</w:t>
+              <w:t>e6d3d57</w:t>
             </w:r>
           </w:p>
         </w:tc>
@@ -7836,7 +7850,7 @@
                 <w:rFonts w:ascii="Times New Roman" w:hAnsi="Times New Roman"/>
                 <w:sz w:val="22"/>
               </w:rPr>
-              <w:t>09/05/2026</w:t>
+              <w:t>10/05/2026</w:t>
             </w:r>
           </w:p>
         </w:tc>
@@ -7890,43 +7904,29 @@
             <w:r/>
             <w:r>
               <w:rPr>
+                <w:rFonts w:ascii="Consolas" w:hAnsi="Consolas"/>
+                <w:sz w:val="20"/>
+              </w:rPr>
+              <w:t>chore: synchronize repository with final local workspace state</w:t>
+            </w:r>
+          </w:p>
+        </w:tc>
+        <w:tc>
+          <w:tcPr>
+            <w:tcW w:type="dxa" w:w="1656"/>
+          </w:tcPr>
+          <w:p>
+            <w:pPr>
+              <w:spacing w:before="60" w:after="60"/>
+              <w:jc w:val="left"/>
+            </w:pPr>
+            <w:r/>
+            <w:r>
+              <w:rPr>
                 <w:rFonts w:ascii="Times New Roman" w:hAnsi="Times New Roman"/>
                 <w:sz w:val="22"/>
               </w:rPr>
-              <w:t xml:space="preserve">*Gắn thẻ tag </w:t>
-            </w:r>
-            <w:r>
-              <w:rPr>
-                <w:rFonts w:ascii="Consolas" w:hAnsi="Consolas"/>
-                <w:sz w:val="20"/>
-              </w:rPr>
-              <w:t>v1.0-final</w:t>
-            </w:r>
-            <w:r>
-              <w:rPr>
-                <w:rFonts w:ascii="Times New Roman" w:hAnsi="Times New Roman"/>
-                <w:sz w:val="22"/>
-              </w:rPr>
-              <w:t xml:space="preserve"> tại phiên bản hoàn thiện nộp báo cáo*</w:t>
-            </w:r>
-          </w:p>
-        </w:tc>
-        <w:tc>
-          <w:tcPr>
-            <w:tcW w:type="dxa" w:w="1656"/>
-          </w:tcPr>
-          <w:p>
-            <w:pPr>
-              <w:spacing w:before="60" w:after="60"/>
-              <w:jc w:val="left"/>
-            </w:pPr>
-            <w:r/>
-            <w:r>
-              <w:rPr>
-                <w:rFonts w:ascii="Times New Roman" w:hAnsi="Times New Roman"/>
-                <w:sz w:val="22"/>
-              </w:rPr>
-              <w:t>Chuyển giao đồ án</w:t>
+              <w:t>WBS 9.1</w:t>
             </w:r>
           </w:p>
         </w:tc>
@@ -7948,7 +7948,7 @@
                 <w:b/>
                 <w:sz w:val="22"/>
               </w:rPr>
-              <w:t>7f1d99c</w:t>
+              <w:t>d2a1150</w:t>
             </w:r>
           </w:p>
         </w:tc>
@@ -7967,7 +7967,7 @@
                 <w:rFonts w:ascii="Times New Roman" w:hAnsi="Times New Roman"/>
                 <w:sz w:val="22"/>
               </w:rPr>
-              <w:t>10/05/2026</w:t>
+              <w:t>11/05/2026</w:t>
             </w:r>
           </w:p>
         </w:tc>
@@ -8024,7 +8024,7 @@
                 <w:rFonts w:ascii="Consolas" w:hAnsi="Consolas"/>
                 <w:sz w:val="20"/>
               </w:rPr>
-              <w:t>chore: synchronize repository with final local workspace state</w:t>
+              <w:t>docs(readme): add updates to readme</w:t>
             </w:r>
           </w:p>
         </w:tc>

</xml_diff>

<commit_message>
docs(report): update chapter 7 commit hashes and sync docx
</commit_message>
<xml_diff>
--- a/Chuong07_Git.docx
+++ b/Chuong07_Git.docx
@@ -1499,7 +1499,7 @@
                 <w:b/>
                 <w:sz w:val="22"/>
               </w:rPr>
-              <w:t>0270cb4</w:t>
+              <w:t>d530308</w:t>
             </w:r>
           </w:p>
         </w:tc>
@@ -1616,7 +1616,7 @@
                 <w:b/>
                 <w:sz w:val="22"/>
               </w:rPr>
-              <w:t>0c2863f</w:t>
+              <w:t>03fdb53</w:t>
             </w:r>
           </w:p>
         </w:tc>
@@ -1733,7 +1733,7 @@
                 <w:b/>
                 <w:sz w:val="22"/>
               </w:rPr>
-              <w:t>dc5c6df</w:t>
+              <w:t>d08c763</w:t>
             </w:r>
           </w:p>
         </w:tc>
@@ -1850,7 +1850,7 @@
                 <w:b/>
                 <w:sz w:val="22"/>
               </w:rPr>
-              <w:t>5b9ea0f</w:t>
+              <w:t>a9a4486</w:t>
             </w:r>
           </w:p>
         </w:tc>
@@ -1967,7 +1967,7 @@
                 <w:b/>
                 <w:sz w:val="22"/>
               </w:rPr>
-              <w:t>6eaaf6f</w:t>
+              <w:t>b31d4c1</w:t>
             </w:r>
           </w:p>
         </w:tc>
@@ -2084,7 +2084,7 @@
                 <w:b/>
                 <w:sz w:val="22"/>
               </w:rPr>
-              <w:t>b3e176a</w:t>
+              <w:t>3fd293b</w:t>
             </w:r>
           </w:p>
         </w:tc>
@@ -2201,7 +2201,7 @@
                 <w:b/>
                 <w:sz w:val="22"/>
               </w:rPr>
-              <w:t>18adf37</w:t>
+              <w:t>7f738ed</w:t>
             </w:r>
           </w:p>
         </w:tc>
@@ -2318,7 +2318,7 @@
                 <w:b/>
                 <w:sz w:val="22"/>
               </w:rPr>
-              <w:t>a1ffaa4</w:t>
+              <w:t>b31d4c1</w:t>
             </w:r>
           </w:p>
         </w:tc>
@@ -2435,7 +2435,7 @@
                 <w:b/>
                 <w:sz w:val="22"/>
               </w:rPr>
-              <w:t>d953498</w:t>
+              <w:t>e8fb004</w:t>
             </w:r>
           </w:p>
         </w:tc>
@@ -2552,7 +2552,7 @@
                 <w:b/>
                 <w:sz w:val="22"/>
               </w:rPr>
-              <w:t>62e6ddb</w:t>
+              <w:t>61eb26c</w:t>
             </w:r>
           </w:p>
         </w:tc>
@@ -2669,7 +2669,7 @@
                 <w:b/>
                 <w:sz w:val="22"/>
               </w:rPr>
-              <w:t>3540479</w:t>
+              <w:t>38922fc</w:t>
             </w:r>
           </w:p>
         </w:tc>
@@ -2786,7 +2786,7 @@
                 <w:b/>
                 <w:sz w:val="22"/>
               </w:rPr>
-              <w:t>ca54baf</w:t>
+              <w:t>b31d4c1</w:t>
             </w:r>
           </w:p>
         </w:tc>
@@ -2903,7 +2903,7 @@
                 <w:b/>
                 <w:sz w:val="22"/>
               </w:rPr>
-              <w:t>9850b79</w:t>
+              <w:t>0644859</w:t>
             </w:r>
           </w:p>
         </w:tc>
@@ -3020,7 +3020,7 @@
                 <w:b/>
                 <w:sz w:val="22"/>
               </w:rPr>
-              <w:t>074fcae</w:t>
+              <w:t>acd78e0</w:t>
             </w:r>
           </w:p>
         </w:tc>
@@ -3137,7 +3137,7 @@
                 <w:b/>
                 <w:sz w:val="22"/>
               </w:rPr>
-              <w:t>649117b</w:t>
+              <w:t>b61f19d</w:t>
             </w:r>
           </w:p>
         </w:tc>
@@ -3254,7 +3254,7 @@
                 <w:b/>
                 <w:sz w:val="22"/>
               </w:rPr>
-              <w:t>0c0ad04</w:t>
+              <w:t>65c9184</w:t>
             </w:r>
           </w:p>
         </w:tc>
@@ -3488,7 +3488,7 @@
                 <w:b/>
                 <w:sz w:val="22"/>
               </w:rPr>
-              <w:t>ded9afc</w:t>
+              <w:t>6b7f90b</w:t>
             </w:r>
           </w:p>
         </w:tc>
@@ -3605,7 +3605,7 @@
                 <w:b/>
                 <w:sz w:val="22"/>
               </w:rPr>
-              <w:t>347500b</w:t>
+              <w:t>882bb1a</w:t>
             </w:r>
           </w:p>
         </w:tc>
@@ -3722,7 +3722,7 @@
                 <w:b/>
                 <w:sz w:val="22"/>
               </w:rPr>
-              <w:t>11df38b</w:t>
+              <w:t>ea3377d</w:t>
             </w:r>
           </w:p>
         </w:tc>
@@ -3839,7 +3839,7 @@
                 <w:b/>
                 <w:sz w:val="22"/>
               </w:rPr>
-              <w:t>e1a633d</w:t>
+              <w:t>0712249</w:t>
             </w:r>
           </w:p>
         </w:tc>
@@ -3956,7 +3956,7 @@
                 <w:b/>
                 <w:sz w:val="22"/>
               </w:rPr>
-              <w:t>e0ce79a</w:t>
+              <w:t>9ad8d76</w:t>
             </w:r>
           </w:p>
         </w:tc>
@@ -4073,7 +4073,7 @@
                 <w:b/>
                 <w:sz w:val="22"/>
               </w:rPr>
-              <w:t>441353b</w:t>
+              <w:t>ea3377d</w:t>
             </w:r>
           </w:p>
         </w:tc>
@@ -4190,7 +4190,7 @@
                 <w:b/>
                 <w:sz w:val="22"/>
               </w:rPr>
-              <w:t>7c53e1d</w:t>
+              <w:t>8a9e9fd</w:t>
             </w:r>
           </w:p>
         </w:tc>
@@ -4307,7 +4307,7 @@
                 <w:b/>
                 <w:sz w:val="22"/>
               </w:rPr>
-              <w:t>50865d2</w:t>
+              <w:t>c900559</w:t>
             </w:r>
           </w:p>
         </w:tc>
@@ -4424,7 +4424,7 @@
                 <w:b/>
                 <w:sz w:val="22"/>
               </w:rPr>
-              <w:t>2a2cb87</w:t>
+              <w:t>f4c2e12</w:t>
             </w:r>
           </w:p>
         </w:tc>
@@ -4541,7 +4541,7 @@
                 <w:b/>
                 <w:sz w:val="22"/>
               </w:rPr>
-              <w:t>c3b856f</w:t>
+              <w:t>c46e5fc</w:t>
             </w:r>
           </w:p>
         </w:tc>
@@ -4658,7 +4658,7 @@
                 <w:b/>
                 <w:sz w:val="22"/>
               </w:rPr>
-              <w:t>8e5c41b</w:t>
+              <w:t>0bb9405</w:t>
             </w:r>
           </w:p>
         </w:tc>
@@ -4775,7 +4775,7 @@
                 <w:b/>
                 <w:sz w:val="22"/>
               </w:rPr>
-              <w:t>6b56d28</w:t>
+              <w:t>c46658b</w:t>
             </w:r>
           </w:p>
         </w:tc>
@@ -4892,7 +4892,7 @@
                 <w:b/>
                 <w:sz w:val="22"/>
               </w:rPr>
-              <w:t>55e7094</w:t>
+              <w:t>ff008a5</w:t>
             </w:r>
           </w:p>
         </w:tc>
@@ -5009,7 +5009,7 @@
                 <w:b/>
                 <w:sz w:val="22"/>
               </w:rPr>
-              <w:t>a3adef1</w:t>
+              <w:t>d72bffa</w:t>
             </w:r>
           </w:p>
         </w:tc>
@@ -5126,7 +5126,7 @@
                 <w:b/>
                 <w:sz w:val="22"/>
               </w:rPr>
-              <w:t>a4987e3</w:t>
+              <w:t>aa5904d</w:t>
             </w:r>
           </w:p>
         </w:tc>
@@ -5243,7 +5243,7 @@
                 <w:b/>
                 <w:sz w:val="22"/>
               </w:rPr>
-              <w:t>c92037e</w:t>
+              <w:t>e18f33e</w:t>
             </w:r>
           </w:p>
         </w:tc>
@@ -5360,7 +5360,7 @@
                 <w:b/>
                 <w:sz w:val="22"/>
               </w:rPr>
-              <w:t>d617ac1</w:t>
+              <w:t>c2fafba</w:t>
             </w:r>
           </w:p>
         </w:tc>
@@ -5477,7 +5477,7 @@
                 <w:b/>
                 <w:sz w:val="22"/>
               </w:rPr>
-              <w:t>3bf8085</w:t>
+              <w:t>aa56e2a</w:t>
             </w:r>
           </w:p>
         </w:tc>
@@ -5594,7 +5594,7 @@
                 <w:b/>
                 <w:sz w:val="22"/>
               </w:rPr>
-              <w:t>6e03ef8</w:t>
+              <w:t>de4a1bb</w:t>
             </w:r>
           </w:p>
         </w:tc>
@@ -5711,7 +5711,7 @@
                 <w:b/>
                 <w:sz w:val="22"/>
               </w:rPr>
-              <w:t>287bef3</w:t>
+              <w:t>bc51d9c</w:t>
             </w:r>
           </w:p>
         </w:tc>
@@ -5828,7 +5828,7 @@
                 <w:b/>
                 <w:sz w:val="22"/>
               </w:rPr>
-              <w:t>9bd17d6</w:t>
+              <w:t>a481d09</w:t>
             </w:r>
           </w:p>
         </w:tc>
@@ -5945,7 +5945,7 @@
                 <w:b/>
                 <w:sz w:val="22"/>
               </w:rPr>
-              <w:t>7e1ca5e</w:t>
+              <w:t>b98ba46</w:t>
             </w:r>
           </w:p>
         </w:tc>
@@ -6062,7 +6062,7 @@
                 <w:b/>
                 <w:sz w:val="22"/>
               </w:rPr>
-              <w:t>3b7b0b0</w:t>
+              <w:t>98c380c</w:t>
             </w:r>
           </w:p>
         </w:tc>
@@ -6179,7 +6179,7 @@
                 <w:b/>
                 <w:sz w:val="22"/>
               </w:rPr>
-              <w:t>eedfb52</w:t>
+              <w:t>892ee4b</w:t>
             </w:r>
           </w:p>
         </w:tc>
@@ -6296,7 +6296,7 @@
                 <w:b/>
                 <w:sz w:val="22"/>
               </w:rPr>
-              <w:t>173b25f</w:t>
+              <w:t>31af64e</w:t>
             </w:r>
           </w:p>
         </w:tc>
@@ -6413,7 +6413,7 @@
                 <w:b/>
                 <w:sz w:val="22"/>
               </w:rPr>
-              <w:t>f45d21b</w:t>
+              <w:t>e0af799</w:t>
             </w:r>
           </w:p>
         </w:tc>
@@ -6530,7 +6530,7 @@
                 <w:b/>
                 <w:sz w:val="22"/>
               </w:rPr>
-              <w:t>d300590</w:t>
+              <w:t>3cebe68</w:t>
             </w:r>
           </w:p>
         </w:tc>
@@ -6647,7 +6647,7 @@
                 <w:b/>
                 <w:sz w:val="22"/>
               </w:rPr>
-              <w:t>fb845a4</w:t>
+              <w:t>e703a62</w:t>
             </w:r>
           </w:p>
         </w:tc>
@@ -6764,7 +6764,7 @@
                 <w:b/>
                 <w:sz w:val="22"/>
               </w:rPr>
-              <w:t>39829b0</w:t>
+              <w:t>f2fc40c</w:t>
             </w:r>
           </w:p>
         </w:tc>
@@ -6881,7 +6881,7 @@
                 <w:b/>
                 <w:sz w:val="22"/>
               </w:rPr>
-              <w:t>cbb80ac</w:t>
+              <w:t>5da5057</w:t>
             </w:r>
           </w:p>
         </w:tc>
@@ -6998,7 +6998,7 @@
                 <w:b/>
                 <w:sz w:val="22"/>
               </w:rPr>
-              <w:t>87dcfc8</w:t>
+              <w:t>4a0d62e</w:t>
             </w:r>
           </w:p>
         </w:tc>
@@ -7115,7 +7115,7 @@
                 <w:b/>
                 <w:sz w:val="22"/>
               </w:rPr>
-              <w:t>2564aba</w:t>
+              <w:t>1fc067c</w:t>
             </w:r>
           </w:p>
         </w:tc>
@@ -7232,7 +7232,7 @@
                 <w:b/>
                 <w:sz w:val="22"/>
               </w:rPr>
-              <w:t>a67857d</w:t>
+              <w:t>578c55a</w:t>
             </w:r>
           </w:p>
         </w:tc>
@@ -7349,7 +7349,7 @@
                 <w:b/>
                 <w:sz w:val="22"/>
               </w:rPr>
-              <w:t>b16d879</w:t>
+              <w:t>1ca3ff6</w:t>
             </w:r>
           </w:p>
         </w:tc>
@@ -7466,7 +7466,7 @@
                 <w:b/>
                 <w:sz w:val="22"/>
               </w:rPr>
-              <w:t>218ee9d</w:t>
+              <w:t>7b7abcf</w:t>
             </w:r>
           </w:p>
         </w:tc>
@@ -7583,7 +7583,7 @@
                 <w:b/>
                 <w:sz w:val="22"/>
               </w:rPr>
-              <w:t>5409d70</w:t>
+              <w:t>2285453</w:t>
             </w:r>
           </w:p>
         </w:tc>
@@ -7831,7 +7831,7 @@
                 <w:b/>
                 <w:sz w:val="22"/>
               </w:rPr>
-              <w:t>e6d3d57</w:t>
+              <w:t>9179967</w:t>
             </w:r>
           </w:p>
         </w:tc>
@@ -7948,7 +7948,7 @@
                 <w:b/>
                 <w:sz w:val="22"/>
               </w:rPr>
-              <w:t>d2a1150</w:t>
+              <w:t>d39c383</w:t>
             </w:r>
           </w:p>
         </w:tc>

</xml_diff>

<commit_message>
docs(report): update chapter 7 hashes and remove deleted commit
</commit_message>
<xml_diff>
--- a/Chuong07_Git.docx
+++ b/Chuong07_Git.docx
@@ -2435,7 +2435,7 @@
                 <w:b/>
                 <w:sz w:val="22"/>
               </w:rPr>
-              <w:t>e8fb004</w:t>
+              <w:t>a3b9ff9</w:t>
             </w:r>
           </w:p>
         </w:tc>
@@ -2552,7 +2552,7 @@
                 <w:b/>
                 <w:sz w:val="22"/>
               </w:rPr>
-              <w:t>61eb26c</w:t>
+              <w:t>31ac545</w:t>
             </w:r>
           </w:p>
         </w:tc>
@@ -2669,7 +2669,7 @@
                 <w:b/>
                 <w:sz w:val="22"/>
               </w:rPr>
-              <w:t>38922fc</w:t>
+              <w:t>14f85d7</w:t>
             </w:r>
           </w:p>
         </w:tc>
@@ -2903,7 +2903,7 @@
                 <w:b/>
                 <w:sz w:val="22"/>
               </w:rPr>
-              <w:t>0644859</w:t>
+              <w:t>e577dd8</w:t>
             </w:r>
           </w:p>
         </w:tc>
@@ -3020,7 +3020,7 @@
                 <w:b/>
                 <w:sz w:val="22"/>
               </w:rPr>
-              <w:t>acd78e0</w:t>
+              <w:t>93f1f21</w:t>
             </w:r>
           </w:p>
         </w:tc>
@@ -3137,7 +3137,7 @@
                 <w:b/>
                 <w:sz w:val="22"/>
               </w:rPr>
-              <w:t>b61f19d</w:t>
+              <w:t>05a3d23</w:t>
             </w:r>
           </w:p>
         </w:tc>
@@ -3156,7 +3156,7 @@
                 <w:rFonts w:ascii="Times New Roman" w:hAnsi="Times New Roman"/>
                 <w:sz w:val="22"/>
               </w:rPr>
-              <w:t>06/02/2026</w:t>
+              <w:t>08/02/2026</w:t>
             </w:r>
           </w:p>
         </w:tc>
@@ -3175,7 +3175,7 @@
                 <w:rFonts w:ascii="Consolas" w:hAnsi="Consolas"/>
                 <w:sz w:val="20"/>
               </w:rPr>
-              <w:t>feature/hardware-setup</w:t>
+              <w:t>main</w:t>
             </w:r>
           </w:p>
         </w:tc>
@@ -3194,26 +3194,7 @@
                 <w:rFonts w:ascii="Times New Roman" w:hAnsi="Times New Roman"/>
                 <w:sz w:val="22"/>
               </w:rPr>
-              <w:t>TrungSy2106</w:t>
-            </w:r>
-          </w:p>
-        </w:tc>
-        <w:tc>
-          <w:tcPr>
-            <w:tcW w:type="dxa" w:w="1656"/>
-          </w:tcPr>
-          <w:p>
-            <w:pPr>
-              <w:spacing w:before="60" w:after="60"/>
-              <w:jc w:val="left"/>
-            </w:pPr>
-            <w:r/>
-            <w:r>
-              <w:rPr>
-                <w:rFonts w:ascii="Consolas" w:hAnsi="Consolas"/>
-                <w:sz w:val="20"/>
-              </w:rPr>
-              <w:t>feat(hw): wire relay channels and construct physical greenhouse mock</w:t>
+              <w:t>MinhTris</w:t>
             </w:r>
           </w:p>
         </w:tc>
@@ -3232,12 +3213,50 @@
                 <w:rFonts w:ascii="Times New Roman" w:hAnsi="Times New Roman"/>
                 <w:sz w:val="22"/>
               </w:rPr>
-              <w:t>WBS 3.2 - 3.3</w:t>
+              <w:t>*Merge branch 'feature/hardware-setup' into main*</w:t>
+            </w:r>
+          </w:p>
+        </w:tc>
+        <w:tc>
+          <w:tcPr>
+            <w:tcW w:type="dxa" w:w="1656"/>
+          </w:tcPr>
+          <w:p>
+            <w:pPr>
+              <w:spacing w:before="60" w:after="60"/>
+              <w:jc w:val="left"/>
+            </w:pPr>
+            <w:r/>
+            <w:r>
+              <w:rPr>
+                <w:rFonts w:ascii="Times New Roman" w:hAnsi="Times New Roman"/>
+                <w:sz w:val="22"/>
+              </w:rPr>
+              <w:t>Tích hợp phần cứng</w:t>
             </w:r>
           </w:p>
         </w:tc>
       </w:tr>
       <w:tr>
+        <w:tc>
+          <w:tcPr>
+            <w:tcW w:type="dxa" w:w="1656"/>
+          </w:tcPr>
+          <w:p>
+            <w:pPr>
+              <w:spacing w:before="60" w:after="60"/>
+              <w:jc w:val="left"/>
+            </w:pPr>
+            <w:r/>
+            <w:r>
+              <w:rPr>
+                <w:rFonts w:ascii="Times New Roman" w:hAnsi="Times New Roman"/>
+                <w:sz w:val="22"/>
+              </w:rPr>
+              <w:t>*Nghỉ Tết*</w:t>
+            </w:r>
+          </w:p>
+        </w:tc>
         <w:tc>
           <w:tcPr>
             <w:tcW w:type="dxa" w:w="1656"/>
@@ -3254,7 +3273,7 @@
                 <w:b/>
                 <w:sz w:val="22"/>
               </w:rPr>
-              <w:t>65c9184</w:t>
+              <w:t>09/02 - 02/03</w:t>
             </w:r>
           </w:p>
         </w:tc>
@@ -3273,26 +3292,7 @@
                 <w:rFonts w:ascii="Times New Roman" w:hAnsi="Times New Roman"/>
                 <w:sz w:val="22"/>
               </w:rPr>
-              <w:t>08/02/2026</w:t>
-            </w:r>
-          </w:p>
-        </w:tc>
-        <w:tc>
-          <w:tcPr>
-            <w:tcW w:type="dxa" w:w="1656"/>
-          </w:tcPr>
-          <w:p>
-            <w:pPr>
-              <w:spacing w:before="60" w:after="60"/>
-              <w:jc w:val="left"/>
-            </w:pPr>
-            <w:r/>
-            <w:r>
-              <w:rPr>
-                <w:rFonts w:ascii="Consolas" w:hAnsi="Consolas"/>
-                <w:sz w:val="20"/>
-              </w:rPr>
-              <w:t>main</w:t>
+              <w:t>-</w:t>
             </w:r>
           </w:p>
         </w:tc>
@@ -3311,7 +3311,7 @@
                 <w:rFonts w:ascii="Times New Roman" w:hAnsi="Times New Roman"/>
                 <w:sz w:val="22"/>
               </w:rPr>
-              <w:t>MinhTris</w:t>
+              <w:t>-</w:t>
             </w:r>
           </w:p>
         </w:tc>
@@ -3330,7 +3330,7 @@
                 <w:rFonts w:ascii="Times New Roman" w:hAnsi="Times New Roman"/>
                 <w:sz w:val="22"/>
               </w:rPr>
-              <w:t>*Merge branch 'feature/hardware-setup' into main*</w:t>
+              <w:t>*Giai đoạn nghỉ Tết Bính Ngọ - Không có hoạt động commit*</w:t>
             </w:r>
           </w:p>
         </w:tc>
@@ -3349,31 +3349,12 @@
                 <w:rFonts w:ascii="Times New Roman" w:hAnsi="Times New Roman"/>
                 <w:sz w:val="22"/>
               </w:rPr>
-              <w:t>Tích hợp phần cứng</w:t>
+              <w:t>-</w:t>
             </w:r>
           </w:p>
         </w:tc>
       </w:tr>
       <w:tr>
-        <w:tc>
-          <w:tcPr>
-            <w:tcW w:type="dxa" w:w="1656"/>
-          </w:tcPr>
-          <w:p>
-            <w:pPr>
-              <w:spacing w:before="60" w:after="60"/>
-              <w:jc w:val="left"/>
-            </w:pPr>
-            <w:r/>
-            <w:r>
-              <w:rPr>
-                <w:rFonts w:ascii="Times New Roman" w:hAnsi="Times New Roman"/>
-                <w:sz w:val="22"/>
-              </w:rPr>
-              <w:t>*Nghỉ Tết*</w:t>
-            </w:r>
-          </w:p>
-        </w:tc>
         <w:tc>
           <w:tcPr>
             <w:tcW w:type="dxa" w:w="1656"/>
@@ -3390,7 +3371,7 @@
                 <w:b/>
                 <w:sz w:val="22"/>
               </w:rPr>
-              <w:t>09/02 - 02/03</w:t>
+              <w:t>016136f</w:t>
             </w:r>
           </w:p>
         </w:tc>
@@ -3409,7 +3390,26 @@
                 <w:rFonts w:ascii="Times New Roman" w:hAnsi="Times New Roman"/>
                 <w:sz w:val="22"/>
               </w:rPr>
-              <w:t>-</w:t>
+              <w:t>04/03/2026</w:t>
+            </w:r>
+          </w:p>
+        </w:tc>
+        <w:tc>
+          <w:tcPr>
+            <w:tcW w:type="dxa" w:w="1656"/>
+          </w:tcPr>
+          <w:p>
+            <w:pPr>
+              <w:spacing w:before="60" w:after="60"/>
+              <w:jc w:val="left"/>
+            </w:pPr>
+            <w:r/>
+            <w:r>
+              <w:rPr>
+                <w:rFonts w:ascii="Consolas" w:hAnsi="Consolas"/>
+                <w:sz w:val="20"/>
+              </w:rPr>
+              <w:t>feature/firmware-esp32</w:t>
             </w:r>
           </w:p>
         </w:tc>
@@ -3428,7 +3428,26 @@
                 <w:rFonts w:ascii="Times New Roman" w:hAnsi="Times New Roman"/>
                 <w:sz w:val="22"/>
               </w:rPr>
-              <w:t>-</w:t>
+              <w:t>TrungSy2106</w:t>
+            </w:r>
+          </w:p>
+        </w:tc>
+        <w:tc>
+          <w:tcPr>
+            <w:tcW w:type="dxa" w:w="1656"/>
+          </w:tcPr>
+          <w:p>
+            <w:pPr>
+              <w:spacing w:before="60" w:after="60"/>
+              <w:jc w:val="left"/>
+            </w:pPr>
+            <w:r/>
+            <w:r>
+              <w:rPr>
+                <w:rFonts w:ascii="Consolas" w:hAnsi="Consolas"/>
+                <w:sz w:val="20"/>
+              </w:rPr>
+              <w:t>feat(fw): implement reading sensors and local LCD display logic</w:t>
             </w:r>
           </w:p>
         </w:tc>
@@ -3447,26 +3466,7 @@
                 <w:rFonts w:ascii="Times New Roman" w:hAnsi="Times New Roman"/>
                 <w:sz w:val="22"/>
               </w:rPr>
-              <w:t>*Giai đoạn nghỉ Tết Bính Ngọ - Không có hoạt động commit*</w:t>
-            </w:r>
-          </w:p>
-        </w:tc>
-        <w:tc>
-          <w:tcPr>
-            <w:tcW w:type="dxa" w:w="1656"/>
-          </w:tcPr>
-          <w:p>
-            <w:pPr>
-              <w:spacing w:before="60" w:after="60"/>
-              <w:jc w:val="left"/>
-            </w:pPr>
-            <w:r/>
-            <w:r>
-              <w:rPr>
-                <w:rFonts w:ascii="Times New Roman" w:hAnsi="Times New Roman"/>
-                <w:sz w:val="22"/>
-              </w:rPr>
-              <w:t>-</w:t>
+              <w:t>WBS 4.1, 4.4</w:t>
             </w:r>
           </w:p>
         </w:tc>
@@ -3488,7 +3488,7 @@
                 <w:b/>
                 <w:sz w:val="22"/>
               </w:rPr>
-              <w:t>6b7f90b</w:t>
+              <w:t>484541d</w:t>
             </w:r>
           </w:p>
         </w:tc>
@@ -3507,7 +3507,7 @@
                 <w:rFonts w:ascii="Times New Roman" w:hAnsi="Times New Roman"/>
                 <w:sz w:val="22"/>
               </w:rPr>
-              <w:t>04/03/2026</w:t>
+              <w:t>07/03/2026</w:t>
             </w:r>
           </w:p>
         </w:tc>
@@ -3564,7 +3564,7 @@
                 <w:rFonts w:ascii="Consolas" w:hAnsi="Consolas"/>
                 <w:sz w:val="20"/>
               </w:rPr>
-              <w:t>feat(fw): implement reading sensors and local LCD display logic</w:t>
+              <w:t>feat(fw): implement WebSocket client telemetry transport</w:t>
             </w:r>
           </w:p>
         </w:tc>
@@ -3583,7 +3583,7 @@
                 <w:rFonts w:ascii="Times New Roman" w:hAnsi="Times New Roman"/>
                 <w:sz w:val="22"/>
               </w:rPr>
-              <w:t>WBS 4.1, 4.4</w:t>
+              <w:t>WBS 4.2</w:t>
             </w:r>
           </w:p>
         </w:tc>
@@ -3605,7 +3605,7 @@
                 <w:b/>
                 <w:sz w:val="22"/>
               </w:rPr>
-              <w:t>882bb1a</w:t>
+              <w:t>f17d977</w:t>
             </w:r>
           </w:p>
         </w:tc>
@@ -3643,7 +3643,7 @@
                 <w:rFonts w:ascii="Consolas" w:hAnsi="Consolas"/>
                 <w:sz w:val="20"/>
               </w:rPr>
-              <w:t>feature/firmware-esp32</w:t>
+              <w:t>main</w:t>
             </w:r>
           </w:p>
         </w:tc>
@@ -3662,26 +3662,7 @@
                 <w:rFonts w:ascii="Times New Roman" w:hAnsi="Times New Roman"/>
                 <w:sz w:val="22"/>
               </w:rPr>
-              <w:t>TrungSy2106</w:t>
-            </w:r>
-          </w:p>
-        </w:tc>
-        <w:tc>
-          <w:tcPr>
-            <w:tcW w:type="dxa" w:w="1656"/>
-          </w:tcPr>
-          <w:p>
-            <w:pPr>
-              <w:spacing w:before="60" w:after="60"/>
-              <w:jc w:val="left"/>
-            </w:pPr>
-            <w:r/>
-            <w:r>
-              <w:rPr>
-                <w:rFonts w:ascii="Consolas" w:hAnsi="Consolas"/>
-                <w:sz w:val="20"/>
-              </w:rPr>
-              <w:t>feat(fw): implement WebSocket client telemetry transport</w:t>
+              <w:t>MinhTris</w:t>
             </w:r>
           </w:p>
         </w:tc>
@@ -3700,7 +3681,26 @@
                 <w:rFonts w:ascii="Times New Roman" w:hAnsi="Times New Roman"/>
                 <w:sz w:val="22"/>
               </w:rPr>
-              <w:t>WBS 4.2</w:t>
+              <w:t>*Merge branch 'feature/firmware-esp32' into main*</w:t>
+            </w:r>
+          </w:p>
+        </w:tc>
+        <w:tc>
+          <w:tcPr>
+            <w:tcW w:type="dxa" w:w="1656"/>
+          </w:tcPr>
+          <w:p>
+            <w:pPr>
+              <w:spacing w:before="60" w:after="60"/>
+              <w:jc w:val="left"/>
+            </w:pPr>
+            <w:r/>
+            <w:r>
+              <w:rPr>
+                <w:rFonts w:ascii="Times New Roman" w:hAnsi="Times New Roman"/>
+                <w:sz w:val="22"/>
+              </w:rPr>
+              <w:t>Tích hợp FW đợt 1</w:t>
             </w:r>
           </w:p>
         </w:tc>
@@ -3722,7 +3722,7 @@
                 <w:b/>
                 <w:sz w:val="22"/>
               </w:rPr>
-              <w:t>ea3377d</w:t>
+              <w:t>6eb3dc0</w:t>
             </w:r>
           </w:p>
         </w:tc>
@@ -3741,7 +3741,7 @@
                 <w:rFonts w:ascii="Times New Roman" w:hAnsi="Times New Roman"/>
                 <w:sz w:val="22"/>
               </w:rPr>
-              <w:t>07/03/2026</w:t>
+              <w:t>10/03/2026</w:t>
             </w:r>
           </w:p>
         </w:tc>
@@ -3760,7 +3760,7 @@
                 <w:rFonts w:ascii="Consolas" w:hAnsi="Consolas"/>
                 <w:sz w:val="20"/>
               </w:rPr>
-              <w:t>main</w:t>
+              <w:t>feature/ai-arx-model</w:t>
             </w:r>
           </w:p>
         </w:tc>
@@ -3795,29 +3795,29 @@
             <w:r/>
             <w:r>
               <w:rPr>
+                <w:rFonts w:ascii="Consolas" w:hAnsi="Consolas"/>
+                <w:sz w:val="20"/>
+              </w:rPr>
+              <w:t>feat(ai-arx): train and validate ARX plant model via least squares</w:t>
+            </w:r>
+          </w:p>
+        </w:tc>
+        <w:tc>
+          <w:tcPr>
+            <w:tcW w:type="dxa" w:w="1656"/>
+          </w:tcPr>
+          <w:p>
+            <w:pPr>
+              <w:spacing w:before="60" w:after="60"/>
+              <w:jc w:val="left"/>
+            </w:pPr>
+            <w:r/>
+            <w:r>
+              <w:rPr>
                 <w:rFonts w:ascii="Times New Roman" w:hAnsi="Times New Roman"/>
                 <w:sz w:val="22"/>
               </w:rPr>
-              <w:t>*Merge branch 'feature/firmware-esp32' into main*</w:t>
-            </w:r>
-          </w:p>
-        </w:tc>
-        <w:tc>
-          <w:tcPr>
-            <w:tcW w:type="dxa" w:w="1656"/>
-          </w:tcPr>
-          <w:p>
-            <w:pPr>
-              <w:spacing w:before="60" w:after="60"/>
-              <w:jc w:val="left"/>
-            </w:pPr>
-            <w:r/>
-            <w:r>
-              <w:rPr>
-                <w:rFonts w:ascii="Times New Roman" w:hAnsi="Times New Roman"/>
-                <w:sz w:val="22"/>
-              </w:rPr>
-              <w:t>Tích hợp FW đợt 1</w:t>
+              <w:t>WBS 6.2</w:t>
             </w:r>
           </w:p>
         </w:tc>
@@ -3839,7 +3839,7 @@
                 <w:b/>
                 <w:sz w:val="22"/>
               </w:rPr>
-              <w:t>0712249</w:t>
+              <w:t>57f1fe3</w:t>
             </w:r>
           </w:p>
         </w:tc>
@@ -3858,7 +3858,7 @@
                 <w:rFonts w:ascii="Times New Roman" w:hAnsi="Times New Roman"/>
                 <w:sz w:val="22"/>
               </w:rPr>
-              <w:t>10/03/2026</w:t>
+              <w:t>11/03/2026</w:t>
             </w:r>
           </w:p>
         </w:tc>
@@ -3877,7 +3877,7 @@
                 <w:rFonts w:ascii="Consolas" w:hAnsi="Consolas"/>
                 <w:sz w:val="20"/>
               </w:rPr>
-              <w:t>feature/ai-arx-model</w:t>
+              <w:t>feature/firmware-esp32</w:t>
             </w:r>
           </w:p>
         </w:tc>
@@ -3896,7 +3896,7 @@
                 <w:rFonts w:ascii="Times New Roman" w:hAnsi="Times New Roman"/>
                 <w:sz w:val="22"/>
               </w:rPr>
-              <w:t>MinhTris</w:t>
+              <w:t>TrungSy2106</w:t>
             </w:r>
           </w:p>
         </w:tc>
@@ -3915,7 +3915,7 @@
                 <w:rFonts w:ascii="Consolas" w:hAnsi="Consolas"/>
                 <w:sz w:val="20"/>
               </w:rPr>
-              <w:t>feat(ai-arx): train and validate ARX plant model via least squares</w:t>
+              <w:t>feat(fw): implement relay control logic and manual auto mode switch</w:t>
             </w:r>
           </w:p>
         </w:tc>
@@ -3934,7 +3934,7 @@
                 <w:rFonts w:ascii="Times New Roman" w:hAnsi="Times New Roman"/>
                 <w:sz w:val="22"/>
               </w:rPr>
-              <w:t>WBS 6.2</w:t>
+              <w:t>WBS 4.3, 4.5</w:t>
             </w:r>
           </w:p>
         </w:tc>
@@ -3956,7 +3956,7 @@
                 <w:b/>
                 <w:sz w:val="22"/>
               </w:rPr>
-              <w:t>9ad8d76</w:t>
+              <w:t>f17d977</w:t>
             </w:r>
           </w:p>
         </w:tc>
@@ -3975,7 +3975,7 @@
                 <w:rFonts w:ascii="Times New Roman" w:hAnsi="Times New Roman"/>
                 <w:sz w:val="22"/>
               </w:rPr>
-              <w:t>11/03/2026</w:t>
+              <w:t>15/03/2026</w:t>
             </w:r>
           </w:p>
         </w:tc>
@@ -3994,7 +3994,7 @@
                 <w:rFonts w:ascii="Consolas" w:hAnsi="Consolas"/>
                 <w:sz w:val="20"/>
               </w:rPr>
-              <w:t>feature/firmware-esp32</w:t>
+              <w:t>main</w:t>
             </w:r>
           </w:p>
         </w:tc>
@@ -4013,26 +4013,7 @@
                 <w:rFonts w:ascii="Times New Roman" w:hAnsi="Times New Roman"/>
                 <w:sz w:val="22"/>
               </w:rPr>
-              <w:t>TrungSy2106</w:t>
-            </w:r>
-          </w:p>
-        </w:tc>
-        <w:tc>
-          <w:tcPr>
-            <w:tcW w:type="dxa" w:w="1656"/>
-          </w:tcPr>
-          <w:p>
-            <w:pPr>
-              <w:spacing w:before="60" w:after="60"/>
-              <w:jc w:val="left"/>
-            </w:pPr>
-            <w:r/>
-            <w:r>
-              <w:rPr>
-                <w:rFonts w:ascii="Consolas" w:hAnsi="Consolas"/>
-                <w:sz w:val="20"/>
-              </w:rPr>
-              <w:t>feat(fw): implement relay control logic and manual auto mode switch</w:t>
+              <w:t>MinhTris</w:t>
             </w:r>
           </w:p>
         </w:tc>
@@ -4051,7 +4032,26 @@
                 <w:rFonts w:ascii="Times New Roman" w:hAnsi="Times New Roman"/>
                 <w:sz w:val="22"/>
               </w:rPr>
-              <w:t>WBS 4.3, 4.5</w:t>
+              <w:t>*Merge branch 'feature/firmware-esp32' into main*</w:t>
+            </w:r>
+          </w:p>
+        </w:tc>
+        <w:tc>
+          <w:tcPr>
+            <w:tcW w:type="dxa" w:w="1656"/>
+          </w:tcPr>
+          <w:p>
+            <w:pPr>
+              <w:spacing w:before="60" w:after="60"/>
+              <w:jc w:val="left"/>
+            </w:pPr>
+            <w:r/>
+            <w:r>
+              <w:rPr>
+                <w:rFonts w:ascii="Times New Roman" w:hAnsi="Times New Roman"/>
+                <w:sz w:val="22"/>
+              </w:rPr>
+              <w:t>Tích hợp FW đợt 2</w:t>
             </w:r>
           </w:p>
         </w:tc>
@@ -4073,7 +4073,7 @@
                 <w:b/>
                 <w:sz w:val="22"/>
               </w:rPr>
-              <w:t>ea3377d</w:t>
+              <w:t>51fa9a5</w:t>
             </w:r>
           </w:p>
         </w:tc>
@@ -4092,7 +4092,7 @@
                 <w:rFonts w:ascii="Times New Roman" w:hAnsi="Times New Roman"/>
                 <w:sz w:val="22"/>
               </w:rPr>
-              <w:t>15/03/2026</w:t>
+              <w:t>18/03/2026</w:t>
             </w:r>
           </w:p>
         </w:tc>
@@ -4111,7 +4111,7 @@
                 <w:rFonts w:ascii="Consolas" w:hAnsi="Consolas"/>
                 <w:sz w:val="20"/>
               </w:rPr>
-              <w:t>main</w:t>
+              <w:t>feature/ai-arx-model</w:t>
             </w:r>
           </w:p>
         </w:tc>
@@ -4146,29 +4146,29 @@
             <w:r/>
             <w:r>
               <w:rPr>
+                <w:rFonts w:ascii="Consolas" w:hAnsi="Consolas"/>
+                <w:sz w:val="20"/>
+              </w:rPr>
+              <w:t>feat(ai-arx): implement evaluation pipeline and save model weights</w:t>
+            </w:r>
+          </w:p>
+        </w:tc>
+        <w:tc>
+          <w:tcPr>
+            <w:tcW w:type="dxa" w:w="1656"/>
+          </w:tcPr>
+          <w:p>
+            <w:pPr>
+              <w:spacing w:before="60" w:after="60"/>
+              <w:jc w:val="left"/>
+            </w:pPr>
+            <w:r/>
+            <w:r>
+              <w:rPr>
                 <w:rFonts w:ascii="Times New Roman" w:hAnsi="Times New Roman"/>
                 <w:sz w:val="22"/>
               </w:rPr>
-              <w:t>*Merge branch 'feature/firmware-esp32' into main*</w:t>
-            </w:r>
-          </w:p>
-        </w:tc>
-        <w:tc>
-          <w:tcPr>
-            <w:tcW w:type="dxa" w:w="1656"/>
-          </w:tcPr>
-          <w:p>
-            <w:pPr>
-              <w:spacing w:before="60" w:after="60"/>
-              <w:jc w:val="left"/>
-            </w:pPr>
-            <w:r/>
-            <w:r>
-              <w:rPr>
-                <w:rFonts w:ascii="Times New Roman" w:hAnsi="Times New Roman"/>
-                <w:sz w:val="22"/>
-              </w:rPr>
-              <w:t>Tích hợp FW đợt 2</w:t>
+              <w:t>WBS 6.2</w:t>
             </w:r>
           </w:p>
         </w:tc>
@@ -4190,7 +4190,7 @@
                 <w:b/>
                 <w:sz w:val="22"/>
               </w:rPr>
-              <w:t>8a9e9fd</w:t>
+              <w:t>f7fd939</w:t>
             </w:r>
           </w:p>
         </w:tc>
@@ -4209,7 +4209,7 @@
                 <w:rFonts w:ascii="Times New Roman" w:hAnsi="Times New Roman"/>
                 <w:sz w:val="22"/>
               </w:rPr>
-              <w:t>18/03/2026</w:t>
+              <w:t>19/03/2026</w:t>
             </w:r>
           </w:p>
         </w:tc>
@@ -4228,7 +4228,7 @@
                 <w:rFonts w:ascii="Consolas" w:hAnsi="Consolas"/>
                 <w:sz w:val="20"/>
               </w:rPr>
-              <w:t>feature/ai-arx-model</w:t>
+              <w:t>feature/backend-django</w:t>
             </w:r>
           </w:p>
         </w:tc>
@@ -4247,7 +4247,7 @@
                 <w:rFonts w:ascii="Times New Roman" w:hAnsi="Times New Roman"/>
                 <w:sz w:val="22"/>
               </w:rPr>
-              <w:t>MinhTris</w:t>
+              <w:t>TrungSy2106</w:t>
             </w:r>
           </w:p>
         </w:tc>
@@ -4266,7 +4266,7 @@
                 <w:rFonts w:ascii="Consolas" w:hAnsi="Consolas"/>
                 <w:sz w:val="20"/>
               </w:rPr>
-              <w:t>feat(ai-arx): implement evaluation pipeline and save model weights</w:t>
+              <w:t>feat(backend): initialize Django server project and configure MySQL connection</w:t>
             </w:r>
           </w:p>
         </w:tc>
@@ -4285,7 +4285,7 @@
                 <w:rFonts w:ascii="Times New Roman" w:hAnsi="Times New Roman"/>
                 <w:sz w:val="22"/>
               </w:rPr>
-              <w:t>WBS 6.2</w:t>
+              <w:t>WBS 5.1, 5.4</w:t>
             </w:r>
           </w:p>
         </w:tc>
@@ -4307,7 +4307,7 @@
                 <w:b/>
                 <w:sz w:val="22"/>
               </w:rPr>
-              <w:t>c900559</w:t>
+              <w:t>9a9315d</w:t>
             </w:r>
           </w:p>
         </w:tc>
@@ -4326,7 +4326,7 @@
                 <w:rFonts w:ascii="Times New Roman" w:hAnsi="Times New Roman"/>
                 <w:sz w:val="22"/>
               </w:rPr>
-              <w:t>19/03/2026</w:t>
+              <w:t>22/03/2026</w:t>
             </w:r>
           </w:p>
         </w:tc>
@@ -4383,7 +4383,7 @@
                 <w:rFonts w:ascii="Consolas" w:hAnsi="Consolas"/>
                 <w:sz w:val="20"/>
               </w:rPr>
-              <w:t>feat(backend): initialize Django server project and configure MySQL connection</w:t>
+              <w:t>feat(backend): implement REST API views for telemetry ingestion</w:t>
             </w:r>
           </w:p>
         </w:tc>
@@ -4402,7 +4402,7 @@
                 <w:rFonts w:ascii="Times New Roman" w:hAnsi="Times New Roman"/>
                 <w:sz w:val="22"/>
               </w:rPr>
-              <w:t>WBS 5.1, 5.4</w:t>
+              <w:t>WBS 5.2</w:t>
             </w:r>
           </w:p>
         </w:tc>
@@ -4424,7 +4424,7 @@
                 <w:b/>
                 <w:sz w:val="22"/>
               </w:rPr>
-              <w:t>f4c2e12</w:t>
+              <w:t>5e18609</w:t>
             </w:r>
           </w:p>
         </w:tc>
@@ -4443,7 +4443,7 @@
                 <w:rFonts w:ascii="Times New Roman" w:hAnsi="Times New Roman"/>
                 <w:sz w:val="22"/>
               </w:rPr>
-              <w:t>22/03/2026</w:t>
+              <w:t>23/03/2026</w:t>
             </w:r>
           </w:p>
         </w:tc>
@@ -4462,7 +4462,7 @@
                 <w:rFonts w:ascii="Consolas" w:hAnsi="Consolas"/>
                 <w:sz w:val="20"/>
               </w:rPr>
-              <w:t>feature/backend-django</w:t>
+              <w:t>main</w:t>
             </w:r>
           </w:p>
         </w:tc>
@@ -4481,26 +4481,7 @@
                 <w:rFonts w:ascii="Times New Roman" w:hAnsi="Times New Roman"/>
                 <w:sz w:val="22"/>
               </w:rPr>
-              <w:t>TrungSy2106</w:t>
-            </w:r>
-          </w:p>
-        </w:tc>
-        <w:tc>
-          <w:tcPr>
-            <w:tcW w:type="dxa" w:w="1656"/>
-          </w:tcPr>
-          <w:p>
-            <w:pPr>
-              <w:spacing w:before="60" w:after="60"/>
-              <w:jc w:val="left"/>
-            </w:pPr>
-            <w:r/>
-            <w:r>
-              <w:rPr>
-                <w:rFonts w:ascii="Consolas" w:hAnsi="Consolas"/>
-                <w:sz w:val="20"/>
-              </w:rPr>
-              <w:t>feat(backend): implement REST API views for telemetry ingestion</w:t>
+              <w:t>MinhTris</w:t>
             </w:r>
           </w:p>
         </w:tc>
@@ -4519,7 +4500,26 @@
                 <w:rFonts w:ascii="Times New Roman" w:hAnsi="Times New Roman"/>
                 <w:sz w:val="22"/>
               </w:rPr>
-              <w:t>WBS 5.2</w:t>
+              <w:t>*Merge branch 'feature/ai-arx-model' into main*</w:t>
+            </w:r>
+          </w:p>
+        </w:tc>
+        <w:tc>
+          <w:tcPr>
+            <w:tcW w:type="dxa" w:w="1656"/>
+          </w:tcPr>
+          <w:p>
+            <w:pPr>
+              <w:spacing w:before="60" w:after="60"/>
+              <w:jc w:val="left"/>
+            </w:pPr>
+            <w:r/>
+            <w:r>
+              <w:rPr>
+                <w:rFonts w:ascii="Times New Roman" w:hAnsi="Times New Roman"/>
+                <w:sz w:val="22"/>
+              </w:rPr>
+              <w:t>Tích hợp mô hình ARX</w:t>
             </w:r>
           </w:p>
         </w:tc>
@@ -4541,7 +4541,7 @@
                 <w:b/>
                 <w:sz w:val="22"/>
               </w:rPr>
-              <w:t>c46e5fc</w:t>
+              <w:t>d8093d1</w:t>
             </w:r>
           </w:p>
         </w:tc>
@@ -4560,7 +4560,7 @@
                 <w:rFonts w:ascii="Times New Roman" w:hAnsi="Times New Roman"/>
                 <w:sz w:val="22"/>
               </w:rPr>
-              <w:t>23/03/2026</w:t>
+              <w:t>26/03/2026</w:t>
             </w:r>
           </w:p>
         </w:tc>
@@ -4579,7 +4579,7 @@
                 <w:rFonts w:ascii="Consolas" w:hAnsi="Consolas"/>
                 <w:sz w:val="20"/>
               </w:rPr>
-              <w:t>main</w:t>
+              <w:t>feature/ai-kalman-filter</w:t>
             </w:r>
           </w:p>
         </w:tc>
@@ -4598,7 +4598,26 @@
                 <w:rFonts w:ascii="Times New Roman" w:hAnsi="Times New Roman"/>
                 <w:sz w:val="22"/>
               </w:rPr>
-              <w:t>MinhTris</w:t>
+              <w:t>BapTruongSinh</w:t>
+            </w:r>
+          </w:p>
+        </w:tc>
+        <w:tc>
+          <w:tcPr>
+            <w:tcW w:type="dxa" w:w="1656"/>
+          </w:tcPr>
+          <w:p>
+            <w:pPr>
+              <w:spacing w:before="60" w:after="60"/>
+              <w:jc w:val="left"/>
+            </w:pPr>
+            <w:r/>
+            <w:r>
+              <w:rPr>
+                <w:rFonts w:ascii="Consolas" w:hAnsi="Consolas"/>
+                <w:sz w:val="20"/>
+              </w:rPr>
+              <w:t>feat(ai-kalman): implement adaptive Kalman filter logic for moisture signal</w:t>
             </w:r>
           </w:p>
         </w:tc>
@@ -4617,26 +4636,7 @@
                 <w:rFonts w:ascii="Times New Roman" w:hAnsi="Times New Roman"/>
                 <w:sz w:val="22"/>
               </w:rPr>
-              <w:t>*Merge branch 'feature/ai-arx-model' into main*</w:t>
-            </w:r>
-          </w:p>
-        </w:tc>
-        <w:tc>
-          <w:tcPr>
-            <w:tcW w:type="dxa" w:w="1656"/>
-          </w:tcPr>
-          <w:p>
-            <w:pPr>
-              <w:spacing w:before="60" w:after="60"/>
-              <w:jc w:val="left"/>
-            </w:pPr>
-            <w:r/>
-            <w:r>
-              <w:rPr>
-                <w:rFonts w:ascii="Times New Roman" w:hAnsi="Times New Roman"/>
-                <w:sz w:val="22"/>
-              </w:rPr>
-              <w:t>Tích hợp mô hình ARX</w:t>
+              <w:t>WBS 6.3</w:t>
             </w:r>
           </w:p>
         </w:tc>
@@ -4658,7 +4658,7 @@
                 <w:b/>
                 <w:sz w:val="22"/>
               </w:rPr>
-              <w:t>0bb9405</w:t>
+              <w:t>fe660fa</w:t>
             </w:r>
           </w:p>
         </w:tc>
@@ -4696,7 +4696,7 @@
                 <w:rFonts w:ascii="Consolas" w:hAnsi="Consolas"/>
                 <w:sz w:val="20"/>
               </w:rPr>
-              <w:t>feature/ai-kalman-filter</w:t>
+              <w:t>feature/backend-django</w:t>
             </w:r>
           </w:p>
         </w:tc>
@@ -4715,7 +4715,7 @@
                 <w:rFonts w:ascii="Times New Roman" w:hAnsi="Times New Roman"/>
                 <w:sz w:val="22"/>
               </w:rPr>
-              <w:t>BapTruongSinh</w:t>
+              <w:t>TrungSy2106</w:t>
             </w:r>
           </w:p>
         </w:tc>
@@ -4734,7 +4734,7 @@
                 <w:rFonts w:ascii="Consolas" w:hAnsi="Consolas"/>
                 <w:sz w:val="20"/>
               </w:rPr>
-              <w:t>feat(ai-kalman): implement adaptive Kalman filter logic for moisture signal</w:t>
+              <w:t>feat(backend): add WebSocket routing and consumers using Django Channels</w:t>
             </w:r>
           </w:p>
         </w:tc>
@@ -4753,7 +4753,7 @@
                 <w:rFonts w:ascii="Times New Roman" w:hAnsi="Times New Roman"/>
                 <w:sz w:val="22"/>
               </w:rPr>
-              <w:t>WBS 6.3</w:t>
+              <w:t>WBS 5.3</w:t>
             </w:r>
           </w:p>
         </w:tc>
@@ -4775,7 +4775,7 @@
                 <w:b/>
                 <w:sz w:val="22"/>
               </w:rPr>
-              <w:t>c46658b</w:t>
+              <w:t>a66d2c7</w:t>
             </w:r>
           </w:p>
         </w:tc>
@@ -4794,7 +4794,7 @@
                 <w:rFonts w:ascii="Times New Roman" w:hAnsi="Times New Roman"/>
                 <w:sz w:val="22"/>
               </w:rPr>
-              <w:t>26/03/2026</w:t>
+              <w:t>30/03/2026</w:t>
             </w:r>
           </w:p>
         </w:tc>
@@ -4813,7 +4813,7 @@
                 <w:rFonts w:ascii="Consolas" w:hAnsi="Consolas"/>
                 <w:sz w:val="20"/>
               </w:rPr>
-              <w:t>feature/backend-django</w:t>
+              <w:t>main</w:t>
             </w:r>
           </w:p>
         </w:tc>
@@ -4832,26 +4832,7 @@
                 <w:rFonts w:ascii="Times New Roman" w:hAnsi="Times New Roman"/>
                 <w:sz w:val="22"/>
               </w:rPr>
-              <w:t>TrungSy2106</w:t>
-            </w:r>
-          </w:p>
-        </w:tc>
-        <w:tc>
-          <w:tcPr>
-            <w:tcW w:type="dxa" w:w="1656"/>
-          </w:tcPr>
-          <w:p>
-            <w:pPr>
-              <w:spacing w:before="60" w:after="60"/>
-              <w:jc w:val="left"/>
-            </w:pPr>
-            <w:r/>
-            <w:r>
-              <w:rPr>
-                <w:rFonts w:ascii="Consolas" w:hAnsi="Consolas"/>
-                <w:sz w:val="20"/>
-              </w:rPr>
-              <w:t>feat(backend): add WebSocket routing and consumers using Django Channels</w:t>
+              <w:t>MinhTris</w:t>
             </w:r>
           </w:p>
         </w:tc>
@@ -4870,7 +4851,26 @@
                 <w:rFonts w:ascii="Times New Roman" w:hAnsi="Times New Roman"/>
                 <w:sz w:val="22"/>
               </w:rPr>
-              <w:t>WBS 5.3</w:t>
+              <w:t>*Merge branch 'feature/backend-django' into main*</w:t>
+            </w:r>
+          </w:p>
+        </w:tc>
+        <w:tc>
+          <w:tcPr>
+            <w:tcW w:type="dxa" w:w="1656"/>
+          </w:tcPr>
+          <w:p>
+            <w:pPr>
+              <w:spacing w:before="60" w:after="60"/>
+              <w:jc w:val="left"/>
+            </w:pPr>
+            <w:r/>
+            <w:r>
+              <w:rPr>
+                <w:rFonts w:ascii="Times New Roman" w:hAnsi="Times New Roman"/>
+                <w:sz w:val="22"/>
+              </w:rPr>
+              <w:t>Tích hợp Backend Django</w:t>
             </w:r>
           </w:p>
         </w:tc>
@@ -4892,7 +4892,7 @@
                 <w:b/>
                 <w:sz w:val="22"/>
               </w:rPr>
-              <w:t>ff008a5</w:t>
+              <w:t>5011f76</w:t>
             </w:r>
           </w:p>
         </w:tc>
@@ -4911,7 +4911,7 @@
                 <w:rFonts w:ascii="Times New Roman" w:hAnsi="Times New Roman"/>
                 <w:sz w:val="22"/>
               </w:rPr>
-              <w:t>30/03/2026</w:t>
+              <w:t>02/04/2026</w:t>
             </w:r>
           </w:p>
         </w:tc>
@@ -4930,7 +4930,7 @@
                 <w:rFonts w:ascii="Consolas" w:hAnsi="Consolas"/>
                 <w:sz w:val="20"/>
               </w:rPr>
-              <w:t>main</w:t>
+              <w:t>feature/web-dashboard</w:t>
             </w:r>
           </w:p>
         </w:tc>
@@ -4949,7 +4949,26 @@
                 <w:rFonts w:ascii="Times New Roman" w:hAnsi="Times New Roman"/>
                 <w:sz w:val="22"/>
               </w:rPr>
-              <w:t>MinhTris</w:t>
+              <w:t>TrungSy2106</w:t>
+            </w:r>
+          </w:p>
+        </w:tc>
+        <w:tc>
+          <w:tcPr>
+            <w:tcW w:type="dxa" w:w="1656"/>
+          </w:tcPr>
+          <w:p>
+            <w:pPr>
+              <w:spacing w:before="60" w:after="60"/>
+              <w:jc w:val="left"/>
+            </w:pPr>
+            <w:r/>
+            <w:r>
+              <w:rPr>
+                <w:rFonts w:ascii="Consolas" w:hAnsi="Consolas"/>
+                <w:sz w:val="20"/>
+              </w:rPr>
+              <w:t>feat(web): setup React application scaffolding and UI component templates</w:t>
             </w:r>
           </w:p>
         </w:tc>
@@ -4968,26 +4987,7 @@
                 <w:rFonts w:ascii="Times New Roman" w:hAnsi="Times New Roman"/>
                 <w:sz w:val="22"/>
               </w:rPr>
-              <w:t>*Merge branch 'feature/backend-django' into main*</w:t>
-            </w:r>
-          </w:p>
-        </w:tc>
-        <w:tc>
-          <w:tcPr>
-            <w:tcW w:type="dxa" w:w="1656"/>
-          </w:tcPr>
-          <w:p>
-            <w:pPr>
-              <w:spacing w:before="60" w:after="60"/>
-              <w:jc w:val="left"/>
-            </w:pPr>
-            <w:r/>
-            <w:r>
-              <w:rPr>
-                <w:rFonts w:ascii="Times New Roman" w:hAnsi="Times New Roman"/>
-                <w:sz w:val="22"/>
-              </w:rPr>
-              <w:t>Tích hợp Backend Django</w:t>
+              <w:t>WBS 7.1</w:t>
             </w:r>
           </w:p>
         </w:tc>
@@ -5009,7 +5009,7 @@
                 <w:b/>
                 <w:sz w:val="22"/>
               </w:rPr>
-              <w:t>d72bffa</w:t>
+              <w:t>d8e9e15</w:t>
             </w:r>
           </w:p>
         </w:tc>
@@ -5047,7 +5047,7 @@
                 <w:rFonts w:ascii="Consolas" w:hAnsi="Consolas"/>
                 <w:sz w:val="20"/>
               </w:rPr>
-              <w:t>feature/web-dashboard</w:t>
+              <w:t>feature/ai-kalman-filter</w:t>
             </w:r>
           </w:p>
         </w:tc>
@@ -5066,7 +5066,7 @@
                 <w:rFonts w:ascii="Times New Roman" w:hAnsi="Times New Roman"/>
                 <w:sz w:val="22"/>
               </w:rPr>
-              <w:t>TrungSy2106</w:t>
+              <w:t>BapTruongSinh</w:t>
             </w:r>
           </w:p>
         </w:tc>
@@ -5085,7 +5085,7 @@
                 <w:rFonts w:ascii="Consolas" w:hAnsi="Consolas"/>
                 <w:sz w:val="20"/>
               </w:rPr>
-              <w:t>feat(web): setup React application scaffolding and UI component templates</w:t>
+              <w:t>test(ai-kalman): add noise filtering simulation regression tests</w:t>
             </w:r>
           </w:p>
         </w:tc>
@@ -5104,7 +5104,7 @@
                 <w:rFonts w:ascii="Times New Roman" w:hAnsi="Times New Roman"/>
                 <w:sz w:val="22"/>
               </w:rPr>
-              <w:t>WBS 7.1</w:t>
+              <w:t>WBS 6.3</w:t>
             </w:r>
           </w:p>
         </w:tc>
@@ -5126,7 +5126,7 @@
                 <w:b/>
                 <w:sz w:val="22"/>
               </w:rPr>
-              <w:t>aa5904d</w:t>
+              <w:t>6beb119</w:t>
             </w:r>
           </w:p>
         </w:tc>
@@ -5145,7 +5145,7 @@
                 <w:rFonts w:ascii="Times New Roman" w:hAnsi="Times New Roman"/>
                 <w:sz w:val="22"/>
               </w:rPr>
-              <w:t>02/04/2026</w:t>
+              <w:t>06/04/2026</w:t>
             </w:r>
           </w:p>
         </w:tc>
@@ -5164,7 +5164,7 @@
                 <w:rFonts w:ascii="Consolas" w:hAnsi="Consolas"/>
                 <w:sz w:val="20"/>
               </w:rPr>
-              <w:t>feature/ai-kalman-filter</w:t>
+              <w:t>main</w:t>
             </w:r>
           </w:p>
         </w:tc>
@@ -5183,26 +5183,7 @@
                 <w:rFonts w:ascii="Times New Roman" w:hAnsi="Times New Roman"/>
                 <w:sz w:val="22"/>
               </w:rPr>
-              <w:t>BapTruongSinh</w:t>
-            </w:r>
-          </w:p>
-        </w:tc>
-        <w:tc>
-          <w:tcPr>
-            <w:tcW w:type="dxa" w:w="1656"/>
-          </w:tcPr>
-          <w:p>
-            <w:pPr>
-              <w:spacing w:before="60" w:after="60"/>
-              <w:jc w:val="left"/>
-            </w:pPr>
-            <w:r/>
-            <w:r>
-              <w:rPr>
-                <w:rFonts w:ascii="Consolas" w:hAnsi="Consolas"/>
-                <w:sz w:val="20"/>
-              </w:rPr>
-              <w:t>test(ai-kalman): add noise filtering simulation regression tests</w:t>
+              <w:t>MinhTris</w:t>
             </w:r>
           </w:p>
         </w:tc>
@@ -5221,7 +5202,26 @@
                 <w:rFonts w:ascii="Times New Roman" w:hAnsi="Times New Roman"/>
                 <w:sz w:val="22"/>
               </w:rPr>
-              <w:t>WBS 6.3</w:t>
+              <w:t>*Merge branch 'feature/ai-kalman-filter' into main*</w:t>
+            </w:r>
+          </w:p>
+        </w:tc>
+        <w:tc>
+          <w:tcPr>
+            <w:tcW w:type="dxa" w:w="1656"/>
+          </w:tcPr>
+          <w:p>
+            <w:pPr>
+              <w:spacing w:before="60" w:after="60"/>
+              <w:jc w:val="left"/>
+            </w:pPr>
+            <w:r/>
+            <w:r>
+              <w:rPr>
+                <w:rFonts w:ascii="Times New Roman" w:hAnsi="Times New Roman"/>
+                <w:sz w:val="22"/>
+              </w:rPr>
+              <w:t>Tích hợp bộ lọc Kalman</w:t>
             </w:r>
           </w:p>
         </w:tc>
@@ -5243,7 +5243,7 @@
                 <w:b/>
                 <w:sz w:val="22"/>
               </w:rPr>
-              <w:t>e18f33e</w:t>
+              <w:t>7ed0bec</w:t>
             </w:r>
           </w:p>
         </w:tc>
@@ -5262,7 +5262,7 @@
                 <w:rFonts w:ascii="Times New Roman" w:hAnsi="Times New Roman"/>
                 <w:sz w:val="22"/>
               </w:rPr>
-              <w:t>06/04/2026</w:t>
+              <w:t>07/04/2026</w:t>
             </w:r>
           </w:p>
         </w:tc>
@@ -5281,7 +5281,7 @@
                 <w:rFonts w:ascii="Consolas" w:hAnsi="Consolas"/>
                 <w:sz w:val="20"/>
               </w:rPr>
-              <w:t>main</w:t>
+              <w:t>feature/web-dashboard</w:t>
             </w:r>
           </w:p>
         </w:tc>
@@ -5300,7 +5300,26 @@
                 <w:rFonts w:ascii="Times New Roman" w:hAnsi="Times New Roman"/>
                 <w:sz w:val="22"/>
               </w:rPr>
-              <w:t>MinhTris</w:t>
+              <w:t>TrungSy2106</w:t>
+            </w:r>
+          </w:p>
+        </w:tc>
+        <w:tc>
+          <w:tcPr>
+            <w:tcW w:type="dxa" w:w="1656"/>
+          </w:tcPr>
+          <w:p>
+            <w:pPr>
+              <w:spacing w:before="60" w:after="60"/>
+              <w:jc w:val="left"/>
+            </w:pPr>
+            <w:r/>
+            <w:r>
+              <w:rPr>
+                <w:rFonts w:ascii="Consolas" w:hAnsi="Consolas"/>
+                <w:sz w:val="20"/>
+              </w:rPr>
+              <w:t>feat(web): integrate WebSocket client connection and draw realtime charts</w:t>
             </w:r>
           </w:p>
         </w:tc>
@@ -5319,26 +5338,7 @@
                 <w:rFonts w:ascii="Times New Roman" w:hAnsi="Times New Roman"/>
                 <w:sz w:val="22"/>
               </w:rPr>
-              <w:t>*Merge branch 'feature/ai-kalman-filter' into main*</w:t>
-            </w:r>
-          </w:p>
-        </w:tc>
-        <w:tc>
-          <w:tcPr>
-            <w:tcW w:type="dxa" w:w="1656"/>
-          </w:tcPr>
-          <w:p>
-            <w:pPr>
-              <w:spacing w:before="60" w:after="60"/>
-              <w:jc w:val="left"/>
-            </w:pPr>
-            <w:r/>
-            <w:r>
-              <w:rPr>
-                <w:rFonts w:ascii="Times New Roman" w:hAnsi="Times New Roman"/>
-                <w:sz w:val="22"/>
-              </w:rPr>
-              <w:t>Tích hợp bộ lọc Kalman</w:t>
+              <w:t>WBS 7.3</w:t>
             </w:r>
           </w:p>
         </w:tc>
@@ -5360,7 +5360,7 @@
                 <w:b/>
                 <w:sz w:val="22"/>
               </w:rPr>
-              <w:t>c2fafba</w:t>
+              <w:t>e61e54b</w:t>
             </w:r>
           </w:p>
         </w:tc>
@@ -5379,7 +5379,7 @@
                 <w:rFonts w:ascii="Times New Roman" w:hAnsi="Times New Roman"/>
                 <w:sz w:val="22"/>
               </w:rPr>
-              <w:t>07/04/2026</w:t>
+              <w:t>09/04/2026</w:t>
             </w:r>
           </w:p>
         </w:tc>
@@ -5398,7 +5398,7 @@
                 <w:rFonts w:ascii="Consolas" w:hAnsi="Consolas"/>
                 <w:sz w:val="20"/>
               </w:rPr>
-              <w:t>feature/web-dashboard</w:t>
+              <w:t>feature/ai-mpc-controller</w:t>
             </w:r>
           </w:p>
         </w:tc>
@@ -5417,7 +5417,7 @@
                 <w:rFonts w:ascii="Times New Roman" w:hAnsi="Times New Roman"/>
                 <w:sz w:val="22"/>
               </w:rPr>
-              <w:t>TrungSy2106</w:t>
+              <w:t>BapTruongSinh</w:t>
             </w:r>
           </w:p>
         </w:tc>
@@ -5436,7 +5436,7 @@
                 <w:rFonts w:ascii="Consolas" w:hAnsi="Consolas"/>
                 <w:sz w:val="20"/>
               </w:rPr>
-              <w:t>feat(web): integrate WebSocket client connection and draw realtime charts</w:t>
+              <w:t>feat(ai-mpc): initialize MPC solver module and define config contracts</w:t>
             </w:r>
           </w:p>
         </w:tc>
@@ -5455,7 +5455,7 @@
                 <w:rFonts w:ascii="Times New Roman" w:hAnsi="Times New Roman"/>
                 <w:sz w:val="22"/>
               </w:rPr>
-              <w:t>WBS 7.3</w:t>
+              <w:t>WBS 6.4</w:t>
             </w:r>
           </w:p>
         </w:tc>
@@ -5477,7 +5477,7 @@
                 <w:b/>
                 <w:sz w:val="22"/>
               </w:rPr>
-              <w:t>aa56e2a</w:t>
+              <w:t>317a8e5</w:t>
             </w:r>
           </w:p>
         </w:tc>
@@ -5496,7 +5496,7 @@
                 <w:rFonts w:ascii="Times New Roman" w:hAnsi="Times New Roman"/>
                 <w:sz w:val="22"/>
               </w:rPr>
-              <w:t>09/04/2026</w:t>
+              <w:t>10/04/2026</w:t>
             </w:r>
           </w:p>
         </w:tc>
@@ -5515,7 +5515,7 @@
                 <w:rFonts w:ascii="Consolas" w:hAnsi="Consolas"/>
                 <w:sz w:val="20"/>
               </w:rPr>
-              <w:t>feature/ai-mpc-controller</w:t>
+              <w:t>feature/web-dashboard</w:t>
             </w:r>
           </w:p>
         </w:tc>
@@ -5534,7 +5534,7 @@
                 <w:rFonts w:ascii="Times New Roman" w:hAnsi="Times New Roman"/>
                 <w:sz w:val="22"/>
               </w:rPr>
-              <w:t>BapTruongSinh</w:t>
+              <w:t>TrungSy2106</w:t>
             </w:r>
           </w:p>
         </w:tc>
@@ -5553,7 +5553,7 @@
                 <w:rFonts w:ascii="Consolas" w:hAnsi="Consolas"/>
                 <w:sz w:val="20"/>
               </w:rPr>
-              <w:t>feat(ai-mpc): initialize MPC solver module and define config contracts</w:t>
+              <w:t>feat(web): add device override buttons and alarm settings page</w:t>
             </w:r>
           </w:p>
         </w:tc>
@@ -5572,7 +5572,7 @@
                 <w:rFonts w:ascii="Times New Roman" w:hAnsi="Times New Roman"/>
                 <w:sz w:val="22"/>
               </w:rPr>
-              <w:t>WBS 6.4</w:t>
+              <w:t>WBS 7.4 - 7.5</w:t>
             </w:r>
           </w:p>
         </w:tc>
@@ -5594,7 +5594,7 @@
                 <w:b/>
                 <w:sz w:val="22"/>
               </w:rPr>
-              <w:t>de4a1bb</w:t>
+              <w:t>dcf9653</w:t>
             </w:r>
           </w:p>
         </w:tc>
@@ -5613,7 +5613,7 @@
                 <w:rFonts w:ascii="Times New Roman" w:hAnsi="Times New Roman"/>
                 <w:sz w:val="22"/>
               </w:rPr>
-              <w:t>10/04/2026</w:t>
+              <w:t>12/04/2026</w:t>
             </w:r>
           </w:p>
         </w:tc>
@@ -5632,7 +5632,7 @@
                 <w:rFonts w:ascii="Consolas" w:hAnsi="Consolas"/>
                 <w:sz w:val="20"/>
               </w:rPr>
-              <w:t>feature/web-dashboard</w:t>
+              <w:t>feature/ai-mpc-controller</w:t>
             </w:r>
           </w:p>
         </w:tc>
@@ -5651,7 +5651,7 @@
                 <w:rFonts w:ascii="Times New Roman" w:hAnsi="Times New Roman"/>
                 <w:sz w:val="22"/>
               </w:rPr>
-              <w:t>TrungSy2106</w:t>
+              <w:t>BapTruongSinh</w:t>
             </w:r>
           </w:p>
         </w:tc>
@@ -5670,7 +5670,7 @@
                 <w:rFonts w:ascii="Consolas" w:hAnsi="Consolas"/>
                 <w:sz w:val="20"/>
               </w:rPr>
-              <w:t>feat(web): add device override buttons and alarm settings page</w:t>
+              <w:t>feat(ai-mpc): implement FAO-56 root-zone water balance model</w:t>
             </w:r>
           </w:p>
         </w:tc>
@@ -5689,7 +5689,7 @@
                 <w:rFonts w:ascii="Times New Roman" w:hAnsi="Times New Roman"/>
                 <w:sz w:val="22"/>
               </w:rPr>
-              <w:t>WBS 7.4 - 7.5</w:t>
+              <w:t>WBS 6.4</w:t>
             </w:r>
           </w:p>
         </w:tc>
@@ -5711,7 +5711,7 @@
                 <w:b/>
                 <w:sz w:val="22"/>
               </w:rPr>
-              <w:t>bc51d9c</w:t>
+              <w:t>ddc1a5b</w:t>
             </w:r>
           </w:p>
         </w:tc>
@@ -5730,7 +5730,7 @@
                 <w:rFonts w:ascii="Times New Roman" w:hAnsi="Times New Roman"/>
                 <w:sz w:val="22"/>
               </w:rPr>
-              <w:t>12/04/2026</w:t>
+              <w:t>13/04/2026</w:t>
             </w:r>
           </w:p>
         </w:tc>
@@ -5749,7 +5749,7 @@
                 <w:rFonts w:ascii="Consolas" w:hAnsi="Consolas"/>
                 <w:sz w:val="20"/>
               </w:rPr>
-              <w:t>feature/ai-mpc-controller</w:t>
+              <w:t>main</w:t>
             </w:r>
           </w:p>
         </w:tc>
@@ -5768,26 +5768,7 @@
                 <w:rFonts w:ascii="Times New Roman" w:hAnsi="Times New Roman"/>
                 <w:sz w:val="22"/>
               </w:rPr>
-              <w:t>BapTruongSinh</w:t>
-            </w:r>
-          </w:p>
-        </w:tc>
-        <w:tc>
-          <w:tcPr>
-            <w:tcW w:type="dxa" w:w="1656"/>
-          </w:tcPr>
-          <w:p>
-            <w:pPr>
-              <w:spacing w:before="60" w:after="60"/>
-              <w:jc w:val="left"/>
-            </w:pPr>
-            <w:r/>
-            <w:r>
-              <w:rPr>
-                <w:rFonts w:ascii="Consolas" w:hAnsi="Consolas"/>
-                <w:sz w:val="20"/>
-              </w:rPr>
-              <w:t>feat(ai-mpc): implement FAO-56 root-zone water balance model</w:t>
+              <w:t>MinhTris</w:t>
             </w:r>
           </w:p>
         </w:tc>
@@ -5806,7 +5787,26 @@
                 <w:rFonts w:ascii="Times New Roman" w:hAnsi="Times New Roman"/>
                 <w:sz w:val="22"/>
               </w:rPr>
-              <w:t>WBS 6.4</w:t>
+              <w:t>*Merge branch 'feature/web-dashboard' into main*</w:t>
+            </w:r>
+          </w:p>
+        </w:tc>
+        <w:tc>
+          <w:tcPr>
+            <w:tcW w:type="dxa" w:w="1656"/>
+          </w:tcPr>
+          <w:p>
+            <w:pPr>
+              <w:spacing w:before="60" w:after="60"/>
+              <w:jc w:val="left"/>
+            </w:pPr>
+            <w:r/>
+            <w:r>
+              <w:rPr>
+                <w:rFonts w:ascii="Times New Roman" w:hAnsi="Times New Roman"/>
+                <w:sz w:val="22"/>
+              </w:rPr>
+              <w:t>Tích hợp Web Dashboard</w:t>
             </w:r>
           </w:p>
         </w:tc>
@@ -5828,7 +5828,7 @@
                 <w:b/>
                 <w:sz w:val="22"/>
               </w:rPr>
-              <w:t>a481d09</w:t>
+              <w:t>2cff247</w:t>
             </w:r>
           </w:p>
         </w:tc>
@@ -5847,7 +5847,7 @@
                 <w:rFonts w:ascii="Times New Roman" w:hAnsi="Times New Roman"/>
                 <w:sz w:val="22"/>
               </w:rPr>
-              <w:t>13/04/2026</w:t>
+              <w:t>15/04/2026</w:t>
             </w:r>
           </w:p>
         </w:tc>
@@ -5866,7 +5866,7 @@
                 <w:rFonts w:ascii="Consolas" w:hAnsi="Consolas"/>
                 <w:sz w:val="20"/>
               </w:rPr>
-              <w:t>main</w:t>
+              <w:t>feature/ai-mpc-controller</w:t>
             </w:r>
           </w:p>
         </w:tc>
@@ -5885,7 +5885,26 @@
                 <w:rFonts w:ascii="Times New Roman" w:hAnsi="Times New Roman"/>
                 <w:sz w:val="22"/>
               </w:rPr>
-              <w:t>MinhTris</w:t>
+              <w:t>BapTruongSinh</w:t>
+            </w:r>
+          </w:p>
+        </w:tc>
+        <w:tc>
+          <w:tcPr>
+            <w:tcW w:type="dxa" w:w="1656"/>
+          </w:tcPr>
+          <w:p>
+            <w:pPr>
+              <w:spacing w:before="60" w:after="60"/>
+              <w:jc w:val="left"/>
+            </w:pPr>
+            <w:r/>
+            <w:r>
+              <w:rPr>
+                <w:rFonts w:ascii="Consolas" w:hAnsi="Consolas"/>
+                <w:sz w:val="20"/>
+              </w:rPr>
+              <w:t>feat(ai-mpc): add AMPC bias adaptation layer using prediction errors</w:t>
             </w:r>
           </w:p>
         </w:tc>
@@ -5904,26 +5923,7 @@
                 <w:rFonts w:ascii="Times New Roman" w:hAnsi="Times New Roman"/>
                 <w:sz w:val="22"/>
               </w:rPr>
-              <w:t>*Merge branch 'feature/web-dashboard' into main*</w:t>
-            </w:r>
-          </w:p>
-        </w:tc>
-        <w:tc>
-          <w:tcPr>
-            <w:tcW w:type="dxa" w:w="1656"/>
-          </w:tcPr>
-          <w:p>
-            <w:pPr>
-              <w:spacing w:before="60" w:after="60"/>
-              <w:jc w:val="left"/>
-            </w:pPr>
-            <w:r/>
-            <w:r>
-              <w:rPr>
-                <w:rFonts w:ascii="Times New Roman" w:hAnsi="Times New Roman"/>
-                <w:sz w:val="22"/>
-              </w:rPr>
-              <w:t>Tích hợp Web Dashboard</w:t>
+              <w:t>WBS 6.4</w:t>
             </w:r>
           </w:p>
         </w:tc>
@@ -5945,7 +5945,7 @@
                 <w:b/>
                 <w:sz w:val="22"/>
               </w:rPr>
-              <w:t>b98ba46</w:t>
+              <w:t>a4e9a26</w:t>
             </w:r>
           </w:p>
         </w:tc>
@@ -5964,7 +5964,7 @@
                 <w:rFonts w:ascii="Times New Roman" w:hAnsi="Times New Roman"/>
                 <w:sz w:val="22"/>
               </w:rPr>
-              <w:t>15/04/2026</w:t>
+              <w:t>18/04/2026</w:t>
             </w:r>
           </w:p>
         </w:tc>
@@ -6021,7 +6021,7 @@
                 <w:rFonts w:ascii="Consolas" w:hAnsi="Consolas"/>
                 <w:sz w:val="20"/>
               </w:rPr>
-              <w:t>feat(ai-mpc): add AMPC bias adaptation layer using prediction errors</w:t>
+              <w:t>feat(ai-mpc): implement HTTP actuator pilot with fail-safe limits</w:t>
             </w:r>
           </w:p>
         </w:tc>
@@ -6062,7 +6062,7 @@
                 <w:b/>
                 <w:sz w:val="22"/>
               </w:rPr>
-              <w:t>98c380c</w:t>
+              <w:t>50d8795</w:t>
             </w:r>
           </w:p>
         </w:tc>
@@ -6081,7 +6081,7 @@
                 <w:rFonts w:ascii="Times New Roman" w:hAnsi="Times New Roman"/>
                 <w:sz w:val="22"/>
               </w:rPr>
-              <w:t>18/04/2026</w:t>
+              <w:t>20/04/2026</w:t>
             </w:r>
           </w:p>
         </w:tc>
@@ -6100,7 +6100,7 @@
                 <w:rFonts w:ascii="Consolas" w:hAnsi="Consolas"/>
                 <w:sz w:val="20"/>
               </w:rPr>
-              <w:t>feature/ai-mpc-controller</w:t>
+              <w:t>main</w:t>
             </w:r>
           </w:p>
         </w:tc>
@@ -6119,26 +6119,7 @@
                 <w:rFonts w:ascii="Times New Roman" w:hAnsi="Times New Roman"/>
                 <w:sz w:val="22"/>
               </w:rPr>
-              <w:t>BapTruongSinh</w:t>
-            </w:r>
-          </w:p>
-        </w:tc>
-        <w:tc>
-          <w:tcPr>
-            <w:tcW w:type="dxa" w:w="1656"/>
-          </w:tcPr>
-          <w:p>
-            <w:pPr>
-              <w:spacing w:before="60" w:after="60"/>
-              <w:jc w:val="left"/>
-            </w:pPr>
-            <w:r/>
-            <w:r>
-              <w:rPr>
-                <w:rFonts w:ascii="Consolas" w:hAnsi="Consolas"/>
-                <w:sz w:val="20"/>
-              </w:rPr>
-              <w:t>feat(ai-mpc): implement HTTP actuator pilot with fail-safe limits</w:t>
+              <w:t>MinhTris</w:t>
             </w:r>
           </w:p>
         </w:tc>
@@ -6157,7 +6138,26 @@
                 <w:rFonts w:ascii="Times New Roman" w:hAnsi="Times New Roman"/>
                 <w:sz w:val="22"/>
               </w:rPr>
-              <w:t>WBS 6.4</w:t>
+              <w:t>*Merge branch 'feature/ai-mpc-controller' into main*</w:t>
+            </w:r>
+          </w:p>
+        </w:tc>
+        <w:tc>
+          <w:tcPr>
+            <w:tcW w:type="dxa" w:w="1656"/>
+          </w:tcPr>
+          <w:p>
+            <w:pPr>
+              <w:spacing w:before="60" w:after="60"/>
+              <w:jc w:val="left"/>
+            </w:pPr>
+            <w:r/>
+            <w:r>
+              <w:rPr>
+                <w:rFonts w:ascii="Times New Roman" w:hAnsi="Times New Roman"/>
+                <w:sz w:val="22"/>
+              </w:rPr>
+              <w:t>Tích hợp bộ điều khiển MPC</w:t>
             </w:r>
           </w:p>
         </w:tc>
@@ -6179,7 +6179,7 @@
                 <w:b/>
                 <w:sz w:val="22"/>
               </w:rPr>
-              <w:t>892ee4b</w:t>
+              <w:t>b45dffe</w:t>
             </w:r>
           </w:p>
         </w:tc>
@@ -6198,7 +6198,7 @@
                 <w:rFonts w:ascii="Times New Roman" w:hAnsi="Times New Roman"/>
                 <w:sz w:val="22"/>
               </w:rPr>
-              <w:t>20/04/2026</w:t>
+              <w:t>22/04/2026</w:t>
             </w:r>
           </w:p>
         </w:tc>
@@ -6217,7 +6217,7 @@
                 <w:rFonts w:ascii="Consolas" w:hAnsi="Consolas"/>
                 <w:sz w:val="20"/>
               </w:rPr>
-              <w:t>main</w:t>
+              <w:t>feature/ai-integration</w:t>
             </w:r>
           </w:p>
         </w:tc>
@@ -6252,29 +6252,29 @@
             <w:r/>
             <w:r>
               <w:rPr>
+                <w:rFonts w:ascii="Consolas" w:hAnsi="Consolas"/>
+                <w:sz w:val="20"/>
+              </w:rPr>
+              <w:t>feat(ai-integration): construct closed-loop execution loop with ARX adapter</w:t>
+            </w:r>
+          </w:p>
+        </w:tc>
+        <w:tc>
+          <w:tcPr>
+            <w:tcW w:type="dxa" w:w="1656"/>
+          </w:tcPr>
+          <w:p>
+            <w:pPr>
+              <w:spacing w:before="60" w:after="60"/>
+              <w:jc w:val="left"/>
+            </w:pPr>
+            <w:r/>
+            <w:r>
+              <w:rPr>
                 <w:rFonts w:ascii="Times New Roman" w:hAnsi="Times New Roman"/>
                 <w:sz w:val="22"/>
               </w:rPr>
-              <w:t>*Merge branch 'feature/ai-mpc-controller' into main*</w:t>
-            </w:r>
-          </w:p>
-        </w:tc>
-        <w:tc>
-          <w:tcPr>
-            <w:tcW w:type="dxa" w:w="1656"/>
-          </w:tcPr>
-          <w:p>
-            <w:pPr>
-              <w:spacing w:before="60" w:after="60"/>
-              <w:jc w:val="left"/>
-            </w:pPr>
-            <w:r/>
-            <w:r>
-              <w:rPr>
-                <w:rFonts w:ascii="Times New Roman" w:hAnsi="Times New Roman"/>
-                <w:sz w:val="22"/>
-              </w:rPr>
-              <w:t>Tích hợp bộ điều khiển MPC</w:t>
+              <w:t>WBS 6.5</w:t>
             </w:r>
           </w:p>
         </w:tc>
@@ -6296,7 +6296,7 @@
                 <w:b/>
                 <w:sz w:val="22"/>
               </w:rPr>
-              <w:t>31af64e</w:t>
+              <w:t>a84a49b</w:t>
             </w:r>
           </w:p>
         </w:tc>
@@ -6315,7 +6315,7 @@
                 <w:rFonts w:ascii="Times New Roman" w:hAnsi="Times New Roman"/>
                 <w:sz w:val="22"/>
               </w:rPr>
-              <w:t>22/04/2026</w:t>
+              <w:t>24/04/2026</w:t>
             </w:r>
           </w:p>
         </w:tc>
@@ -6353,7 +6353,7 @@
                 <w:rFonts w:ascii="Times New Roman" w:hAnsi="Times New Roman"/>
                 <w:sz w:val="22"/>
               </w:rPr>
-              <w:t>MinhTris</w:t>
+              <w:t>BapTruongSinh</w:t>
             </w:r>
           </w:p>
         </w:tc>
@@ -6372,7 +6372,7 @@
                 <w:rFonts w:ascii="Consolas" w:hAnsi="Consolas"/>
                 <w:sz w:val="20"/>
               </w:rPr>
-              <w:t>feat(ai-integration): construct closed-loop execution loop with ARX adapter</w:t>
+              <w:t>feat(ai-integration): connect Kalman filter signals into MPC input bounds</w:t>
             </w:r>
           </w:p>
         </w:tc>
@@ -6413,7 +6413,7 @@
                 <w:b/>
                 <w:sz w:val="22"/>
               </w:rPr>
-              <w:t>e0af799</w:t>
+              <w:t>1e01ab7</w:t>
             </w:r>
           </w:p>
         </w:tc>
@@ -6432,7 +6432,7 @@
                 <w:rFonts w:ascii="Times New Roman" w:hAnsi="Times New Roman"/>
                 <w:sz w:val="22"/>
               </w:rPr>
-              <w:t>24/04/2026</w:t>
+              <w:t>26/04/2026</w:t>
             </w:r>
           </w:p>
         </w:tc>
@@ -6470,7 +6470,7 @@
                 <w:rFonts w:ascii="Times New Roman" w:hAnsi="Times New Roman"/>
                 <w:sz w:val="22"/>
               </w:rPr>
-              <w:t>BapTruongSinh</w:t>
+              <w:t>TrungSy2106</w:t>
             </w:r>
           </w:p>
         </w:tc>
@@ -6489,7 +6489,7 @@
                 <w:rFonts w:ascii="Consolas" w:hAnsi="Consolas"/>
                 <w:sz w:val="20"/>
               </w:rPr>
-              <w:t>feat(ai-integration): connect Kalman filter signals into MPC input bounds</w:t>
+              <w:t>feat(backend): build recommendation api wrapper for django integration</w:t>
             </w:r>
           </w:p>
         </w:tc>
@@ -6530,7 +6530,7 @@
                 <w:b/>
                 <w:sz w:val="22"/>
               </w:rPr>
-              <w:t>3cebe68</w:t>
+              <w:t>60238c2</w:t>
             </w:r>
           </w:p>
         </w:tc>
@@ -6549,7 +6549,7 @@
                 <w:rFonts w:ascii="Times New Roman" w:hAnsi="Times New Roman"/>
                 <w:sz w:val="22"/>
               </w:rPr>
-              <w:t>26/04/2026</w:t>
+              <w:t>27/04/2026</w:t>
             </w:r>
           </w:p>
         </w:tc>
@@ -6568,7 +6568,7 @@
                 <w:rFonts w:ascii="Consolas" w:hAnsi="Consolas"/>
                 <w:sz w:val="20"/>
               </w:rPr>
-              <w:t>feature/ai-integration</w:t>
+              <w:t>main</w:t>
             </w:r>
           </w:p>
         </w:tc>
@@ -6587,26 +6587,7 @@
                 <w:rFonts w:ascii="Times New Roman" w:hAnsi="Times New Roman"/>
                 <w:sz w:val="22"/>
               </w:rPr>
-              <w:t>TrungSy2106</w:t>
-            </w:r>
-          </w:p>
-        </w:tc>
-        <w:tc>
-          <w:tcPr>
-            <w:tcW w:type="dxa" w:w="1656"/>
-          </w:tcPr>
-          <w:p>
-            <w:pPr>
-              <w:spacing w:before="60" w:after="60"/>
-              <w:jc w:val="left"/>
-            </w:pPr>
-            <w:r/>
-            <w:r>
-              <w:rPr>
-                <w:rFonts w:ascii="Consolas" w:hAnsi="Consolas"/>
-                <w:sz w:val="20"/>
-              </w:rPr>
-              <w:t>feat(backend): build recommendation api wrapper for django integration</w:t>
+              <w:t>MinhTris</w:t>
             </w:r>
           </w:p>
         </w:tc>
@@ -6625,7 +6606,26 @@
                 <w:rFonts w:ascii="Times New Roman" w:hAnsi="Times New Roman"/>
                 <w:sz w:val="22"/>
               </w:rPr>
-              <w:t>WBS 6.5</w:t>
+              <w:t>*Merge branch 'feature/ai-integration' into main*</w:t>
+            </w:r>
+          </w:p>
+        </w:tc>
+        <w:tc>
+          <w:tcPr>
+            <w:tcW w:type="dxa" w:w="1656"/>
+          </w:tcPr>
+          <w:p>
+            <w:pPr>
+              <w:spacing w:before="60" w:after="60"/>
+              <w:jc w:val="left"/>
+            </w:pPr>
+            <w:r/>
+            <w:r>
+              <w:rPr>
+                <w:rFonts w:ascii="Times New Roman" w:hAnsi="Times New Roman"/>
+                <w:sz w:val="22"/>
+              </w:rPr>
+              <w:t>Tích hợp hệ thống AI</w:t>
             </w:r>
           </w:p>
         </w:tc>
@@ -6647,7 +6647,7 @@
                 <w:b/>
                 <w:sz w:val="22"/>
               </w:rPr>
-              <w:t>e703a62</w:t>
+              <w:t>ee71947</w:t>
             </w:r>
           </w:p>
         </w:tc>
@@ -6666,7 +6666,7 @@
                 <w:rFonts w:ascii="Times New Roman" w:hAnsi="Times New Roman"/>
                 <w:sz w:val="22"/>
               </w:rPr>
-              <w:t>27/04/2026</w:t>
+              <w:t>29/04/2026</w:t>
             </w:r>
           </w:p>
         </w:tc>
@@ -6685,7 +6685,7 @@
                 <w:rFonts w:ascii="Consolas" w:hAnsi="Consolas"/>
                 <w:sz w:val="20"/>
               </w:rPr>
-              <w:t>main</w:t>
+              <w:t>test/system-regression</w:t>
             </w:r>
           </w:p>
         </w:tc>
@@ -6704,7 +6704,26 @@
                 <w:rFonts w:ascii="Times New Roman" w:hAnsi="Times New Roman"/>
                 <w:sz w:val="22"/>
               </w:rPr>
-              <w:t>MinhTris</w:t>
+              <w:t>BapTruongSinh</w:t>
+            </w:r>
+          </w:p>
+        </w:tc>
+        <w:tc>
+          <w:tcPr>
+            <w:tcW w:type="dxa" w:w="1656"/>
+          </w:tcPr>
+          <w:p>
+            <w:pPr>
+              <w:spacing w:before="60" w:after="60"/>
+              <w:jc w:val="left"/>
+            </w:pPr>
+            <w:r/>
+            <w:r>
+              <w:rPr>
+                <w:rFonts w:ascii="Consolas" w:hAnsi="Consolas"/>
+                <w:sz w:val="20"/>
+              </w:rPr>
+              <w:t>test(mpc): add unit and regression test suite for controller modules</w:t>
             </w:r>
           </w:p>
         </w:tc>
@@ -6723,26 +6742,7 @@
                 <w:rFonts w:ascii="Times New Roman" w:hAnsi="Times New Roman"/>
                 <w:sz w:val="22"/>
               </w:rPr>
-              <w:t>*Merge branch 'feature/ai-integration' into main*</w:t>
-            </w:r>
-          </w:p>
-        </w:tc>
-        <w:tc>
-          <w:tcPr>
-            <w:tcW w:type="dxa" w:w="1656"/>
-          </w:tcPr>
-          <w:p>
-            <w:pPr>
-              <w:spacing w:before="60" w:after="60"/>
-              <w:jc w:val="left"/>
-            </w:pPr>
-            <w:r/>
-            <w:r>
-              <w:rPr>
-                <w:rFonts w:ascii="Times New Roman" w:hAnsi="Times New Roman"/>
-                <w:sz w:val="22"/>
-              </w:rPr>
-              <w:t>Tích hợp hệ thống AI</w:t>
+              <w:t>WBS 8.5</w:t>
             </w:r>
           </w:p>
         </w:tc>
@@ -6764,7 +6764,7 @@
                 <w:b/>
                 <w:sz w:val="22"/>
               </w:rPr>
-              <w:t>f2fc40c</w:t>
+              <w:t>738a9ab</w:t>
             </w:r>
           </w:p>
         </w:tc>
@@ -6783,7 +6783,7 @@
                 <w:rFonts w:ascii="Times New Roman" w:hAnsi="Times New Roman"/>
                 <w:sz w:val="22"/>
               </w:rPr>
-              <w:t>29/04/2026</w:t>
+              <w:t>01/05/2026</w:t>
             </w:r>
           </w:p>
         </w:tc>
@@ -6821,7 +6821,7 @@
                 <w:rFonts w:ascii="Times New Roman" w:hAnsi="Times New Roman"/>
                 <w:sz w:val="22"/>
               </w:rPr>
-              <w:t>BapTruongSinh</w:t>
+              <w:t>TrungSy2106</w:t>
             </w:r>
           </w:p>
         </w:tc>
@@ -6840,7 +6840,7 @@
                 <w:rFonts w:ascii="Consolas" w:hAnsi="Consolas"/>
                 <w:sz w:val="20"/>
               </w:rPr>
-              <w:t>test(mpc): add unit and regression test suite for controller modules</w:t>
+              <w:t>test(system): add end-to-end integration tests for WebSocket loop</w:t>
             </w:r>
           </w:p>
         </w:tc>
@@ -6859,7 +6859,7 @@
                 <w:rFonts w:ascii="Times New Roman" w:hAnsi="Times New Roman"/>
                 <w:sz w:val="22"/>
               </w:rPr>
-              <w:t>WBS 8.5</w:t>
+              <w:t>WBS 8.6</w:t>
             </w:r>
           </w:p>
         </w:tc>
@@ -6881,7 +6881,7 @@
                 <w:b/>
                 <w:sz w:val="22"/>
               </w:rPr>
-              <w:t>5da5057</w:t>
+              <w:t>d27f988</w:t>
             </w:r>
           </w:p>
         </w:tc>
@@ -6900,7 +6900,7 @@
                 <w:rFonts w:ascii="Times New Roman" w:hAnsi="Times New Roman"/>
                 <w:sz w:val="22"/>
               </w:rPr>
-              <w:t>01/05/2026</w:t>
+              <w:t>03/05/2026</w:t>
             </w:r>
           </w:p>
         </w:tc>
@@ -6938,7 +6938,7 @@
                 <w:rFonts w:ascii="Times New Roman" w:hAnsi="Times New Roman"/>
                 <w:sz w:val="22"/>
               </w:rPr>
-              <w:t>TrungSy2106</w:t>
+              <w:t>MinhTris</w:t>
             </w:r>
           </w:p>
         </w:tc>
@@ -6957,7 +6957,7 @@
                 <w:rFonts w:ascii="Consolas" w:hAnsi="Consolas"/>
                 <w:sz w:val="20"/>
               </w:rPr>
-              <w:t>test(system): add end-to-end integration tests for WebSocket loop</w:t>
+              <w:t>test(system): execute system robustness tests under signal dropouts</w:t>
             </w:r>
           </w:p>
         </w:tc>
@@ -6998,7 +6998,7 @@
                 <w:b/>
                 <w:sz w:val="22"/>
               </w:rPr>
-              <w:t>4a0d62e</w:t>
+              <w:t>d5bea6a</w:t>
             </w:r>
           </w:p>
         </w:tc>
@@ -7017,7 +7017,7 @@
                 <w:rFonts w:ascii="Times New Roman" w:hAnsi="Times New Roman"/>
                 <w:sz w:val="22"/>
               </w:rPr>
-              <w:t>03/05/2026</w:t>
+              <w:t>04/05/2026</w:t>
             </w:r>
           </w:p>
         </w:tc>
@@ -7036,7 +7036,7 @@
                 <w:rFonts w:ascii="Consolas" w:hAnsi="Consolas"/>
                 <w:sz w:val="20"/>
               </w:rPr>
-              <w:t>test/system-regression</w:t>
+              <w:t>main</w:t>
             </w:r>
           </w:p>
         </w:tc>
@@ -7071,29 +7071,29 @@
             <w:r/>
             <w:r>
               <w:rPr>
-                <w:rFonts w:ascii="Consolas" w:hAnsi="Consolas"/>
-                <w:sz w:val="20"/>
-              </w:rPr>
-              <w:t>test(system): execute system robustness tests under signal dropouts</w:t>
-            </w:r>
-          </w:p>
-        </w:tc>
-        <w:tc>
-          <w:tcPr>
-            <w:tcW w:type="dxa" w:w="1656"/>
-          </w:tcPr>
-          <w:p>
-            <w:pPr>
-              <w:spacing w:before="60" w:after="60"/>
-              <w:jc w:val="left"/>
-            </w:pPr>
-            <w:r/>
-            <w:r>
-              <w:rPr>
                 <w:rFonts w:ascii="Times New Roman" w:hAnsi="Times New Roman"/>
                 <w:sz w:val="22"/>
               </w:rPr>
-              <w:t>WBS 8.6</w:t>
+              <w:t>*Merge branch 'test/system-regression' into main*</w:t>
+            </w:r>
+          </w:p>
+        </w:tc>
+        <w:tc>
+          <w:tcPr>
+            <w:tcW w:type="dxa" w:w="1656"/>
+          </w:tcPr>
+          <w:p>
+            <w:pPr>
+              <w:spacing w:before="60" w:after="60"/>
+              <w:jc w:val="left"/>
+            </w:pPr>
+            <w:r/>
+            <w:r>
+              <w:rPr>
+                <w:rFonts w:ascii="Times New Roman" w:hAnsi="Times New Roman"/>
+                <w:sz w:val="22"/>
+              </w:rPr>
+              <w:t>Tích hợp Test Suite</w:t>
             </w:r>
           </w:p>
         </w:tc>
@@ -7115,7 +7115,7 @@
                 <w:b/>
                 <w:sz w:val="22"/>
               </w:rPr>
-              <w:t>1fc067c</w:t>
+              <w:t>f8356e2</w:t>
             </w:r>
           </w:p>
         </w:tc>
@@ -7134,7 +7134,7 @@
                 <w:rFonts w:ascii="Times New Roman" w:hAnsi="Times New Roman"/>
                 <w:sz w:val="22"/>
               </w:rPr>
-              <w:t>04/05/2026</w:t>
+              <w:t>05/05/2026</w:t>
             </w:r>
           </w:p>
         </w:tc>
@@ -7153,7 +7153,7 @@
                 <w:rFonts w:ascii="Consolas" w:hAnsi="Consolas"/>
                 <w:sz w:val="20"/>
               </w:rPr>
-              <w:t>main</w:t>
+              <w:t>docs/final-report</w:t>
             </w:r>
           </w:p>
         </w:tc>
@@ -7188,29 +7188,29 @@
             <w:r/>
             <w:r>
               <w:rPr>
+                <w:rFonts w:ascii="Consolas" w:hAnsi="Consolas"/>
+                <w:sz w:val="20"/>
+              </w:rPr>
+              <w:t>docs(report): draft chapters on project management and SOW</w:t>
+            </w:r>
+          </w:p>
+        </w:tc>
+        <w:tc>
+          <w:tcPr>
+            <w:tcW w:type="dxa" w:w="1656"/>
+          </w:tcPr>
+          <w:p>
+            <w:pPr>
+              <w:spacing w:before="60" w:after="60"/>
+              <w:jc w:val="left"/>
+            </w:pPr>
+            <w:r/>
+            <w:r>
+              <w:rPr>
                 <w:rFonts w:ascii="Times New Roman" w:hAnsi="Times New Roman"/>
                 <w:sz w:val="22"/>
               </w:rPr>
-              <w:t>*Merge branch 'test/system-regression' into main*</w:t>
-            </w:r>
-          </w:p>
-        </w:tc>
-        <w:tc>
-          <w:tcPr>
-            <w:tcW w:type="dxa" w:w="1656"/>
-          </w:tcPr>
-          <w:p>
-            <w:pPr>
-              <w:spacing w:before="60" w:after="60"/>
-              <w:jc w:val="left"/>
-            </w:pPr>
-            <w:r/>
-            <w:r>
-              <w:rPr>
-                <w:rFonts w:ascii="Times New Roman" w:hAnsi="Times New Roman"/>
-                <w:sz w:val="22"/>
-              </w:rPr>
-              <w:t>Tích hợp Test Suite</w:t>
+              <w:t>WBS 9.2 - 9.3</w:t>
             </w:r>
           </w:p>
         </w:tc>
@@ -7232,7 +7232,7 @@
                 <w:b/>
                 <w:sz w:val="22"/>
               </w:rPr>
-              <w:t>578c55a</w:t>
+              <w:t>d25059f</w:t>
             </w:r>
           </w:p>
         </w:tc>
@@ -7251,7 +7251,7 @@
                 <w:rFonts w:ascii="Times New Roman" w:hAnsi="Times New Roman"/>
                 <w:sz w:val="22"/>
               </w:rPr>
-              <w:t>05/05/2026</w:t>
+              <w:t>07/05/2026</w:t>
             </w:r>
           </w:p>
         </w:tc>
@@ -7289,7 +7289,7 @@
                 <w:rFonts w:ascii="Times New Roman" w:hAnsi="Times New Roman"/>
                 <w:sz w:val="22"/>
               </w:rPr>
-              <w:t>MinhTris</w:t>
+              <w:t>TrungSy2106</w:t>
             </w:r>
           </w:p>
         </w:tc>
@@ -7308,7 +7308,7 @@
                 <w:rFonts w:ascii="Consolas" w:hAnsi="Consolas"/>
                 <w:sz w:val="20"/>
               </w:rPr>
-              <w:t>docs(report): draft chapters on project management and SOW</w:t>
+              <w:t>docs(report): draft firmware schematics and dashboard interface</w:t>
             </w:r>
           </w:p>
         </w:tc>
@@ -7349,7 +7349,7 @@
                 <w:b/>
                 <w:sz w:val="22"/>
               </w:rPr>
-              <w:t>1ca3ff6</w:t>
+              <w:t>d35e22d</w:t>
             </w:r>
           </w:p>
         </w:tc>
@@ -7368,7 +7368,7 @@
                 <w:rFonts w:ascii="Times New Roman" w:hAnsi="Times New Roman"/>
                 <w:sz w:val="22"/>
               </w:rPr>
-              <w:t>07/05/2026</w:t>
+              <w:t>08/05/2026</w:t>
             </w:r>
           </w:p>
         </w:tc>
@@ -7387,7 +7387,7 @@
                 <w:rFonts w:ascii="Consolas" w:hAnsi="Consolas"/>
                 <w:sz w:val="20"/>
               </w:rPr>
-              <w:t>docs/final-report</w:t>
+              <w:t>main</w:t>
             </w:r>
           </w:p>
         </w:tc>
@@ -7406,26 +7406,7 @@
                 <w:rFonts w:ascii="Times New Roman" w:hAnsi="Times New Roman"/>
                 <w:sz w:val="22"/>
               </w:rPr>
-              <w:t>TrungSy2106</w:t>
-            </w:r>
-          </w:p>
-        </w:tc>
-        <w:tc>
-          <w:tcPr>
-            <w:tcW w:type="dxa" w:w="1656"/>
-          </w:tcPr>
-          <w:p>
-            <w:pPr>
-              <w:spacing w:before="60" w:after="60"/>
-              <w:jc w:val="left"/>
-            </w:pPr>
-            <w:r/>
-            <w:r>
-              <w:rPr>
-                <w:rFonts w:ascii="Consolas" w:hAnsi="Consolas"/>
-                <w:sz w:val="20"/>
-              </w:rPr>
-              <w:t>docs(report): draft firmware schematics and dashboard interface</w:t>
+              <w:t>MinhTris</w:t>
             </w:r>
           </w:p>
         </w:tc>
@@ -7444,7 +7425,26 @@
                 <w:rFonts w:ascii="Times New Roman" w:hAnsi="Times New Roman"/>
                 <w:sz w:val="22"/>
               </w:rPr>
-              <w:t>WBS 9.2 - 9.3</w:t>
+              <w:t>*Merge branch 'docs/final-report' into main*</w:t>
+            </w:r>
+          </w:p>
+        </w:tc>
+        <w:tc>
+          <w:tcPr>
+            <w:tcW w:type="dxa" w:w="1656"/>
+          </w:tcPr>
+          <w:p>
+            <w:pPr>
+              <w:spacing w:before="60" w:after="60"/>
+              <w:jc w:val="left"/>
+            </w:pPr>
+            <w:r/>
+            <w:r>
+              <w:rPr>
+                <w:rFonts w:ascii="Times New Roman" w:hAnsi="Times New Roman"/>
+                <w:sz w:val="22"/>
+              </w:rPr>
+              <w:t>Tích hợp báo cáo hoàn chỉnh</w:t>
             </w:r>
           </w:p>
         </w:tc>
@@ -7466,7 +7466,7 @@
                 <w:b/>
                 <w:sz w:val="22"/>
               </w:rPr>
-              <w:t>7b7abcf</w:t>
+              <w:t>85f954c</w:t>
             </w:r>
           </w:p>
         </w:tc>
@@ -7485,7 +7485,7 @@
                 <w:rFonts w:ascii="Times New Roman" w:hAnsi="Times New Roman"/>
                 <w:sz w:val="22"/>
               </w:rPr>
-              <w:t>08/05/2026</w:t>
+              <w:t>09/05/2026</w:t>
             </w:r>
           </w:p>
         </w:tc>
@@ -7539,29 +7539,29 @@
             <w:r/>
             <w:r>
               <w:rPr>
+                <w:rFonts w:ascii="Consolas" w:hAnsi="Consolas"/>
+                <w:sz w:val="20"/>
+              </w:rPr>
+              <w:t>docs(presentation): compile presentation slide for final defense</w:t>
+            </w:r>
+          </w:p>
+        </w:tc>
+        <w:tc>
+          <w:tcPr>
+            <w:tcW w:type="dxa" w:w="1656"/>
+          </w:tcPr>
+          <w:p>
+            <w:pPr>
+              <w:spacing w:before="60" w:after="60"/>
+              <w:jc w:val="left"/>
+            </w:pPr>
+            <w:r/>
+            <w:r>
+              <w:rPr>
                 <w:rFonts w:ascii="Times New Roman" w:hAnsi="Times New Roman"/>
                 <w:sz w:val="22"/>
               </w:rPr>
-              <w:t>*Merge branch 'docs/final-report' into main*</w:t>
-            </w:r>
-          </w:p>
-        </w:tc>
-        <w:tc>
-          <w:tcPr>
-            <w:tcW w:type="dxa" w:w="1656"/>
-          </w:tcPr>
-          <w:p>
-            <w:pPr>
-              <w:spacing w:before="60" w:after="60"/>
-              <w:jc w:val="left"/>
-            </w:pPr>
-            <w:r/>
-            <w:r>
-              <w:rPr>
-                <w:rFonts w:ascii="Times New Roman" w:hAnsi="Times New Roman"/>
-                <w:sz w:val="22"/>
-              </w:rPr>
-              <w:t>Tích hợp báo cáo hoàn chỉnh</w:t>
+              <w:t>WBS 9.4</w:t>
             </w:r>
           </w:p>
         </w:tc>
@@ -7583,7 +7583,7 @@
                 <w:b/>
                 <w:sz w:val="22"/>
               </w:rPr>
-              <w:t>2285453</w:t>
+              <w:t>Tag `v1.0-final`</w:t>
             </w:r>
           </w:p>
         </w:tc>
@@ -7656,29 +7656,43 @@
             <w:r/>
             <w:r>
               <w:rPr>
+                <w:rFonts w:ascii="Times New Roman" w:hAnsi="Times New Roman"/>
+                <w:sz w:val="22"/>
+              </w:rPr>
+              <w:t xml:space="preserve">*Gắn thẻ tag </w:t>
+            </w:r>
+            <w:r>
+              <w:rPr>
                 <w:rFonts w:ascii="Consolas" w:hAnsi="Consolas"/>
                 <w:sz w:val="20"/>
               </w:rPr>
-              <w:t>docs(presentation): compile presentation slide for final defense</w:t>
-            </w:r>
-          </w:p>
-        </w:tc>
-        <w:tc>
-          <w:tcPr>
-            <w:tcW w:type="dxa" w:w="1656"/>
-          </w:tcPr>
-          <w:p>
-            <w:pPr>
-              <w:spacing w:before="60" w:after="60"/>
-              <w:jc w:val="left"/>
-            </w:pPr>
-            <w:r/>
+              <w:t>v1.0-final</w:t>
+            </w:r>
             <w:r>
               <w:rPr>
                 <w:rFonts w:ascii="Times New Roman" w:hAnsi="Times New Roman"/>
                 <w:sz w:val="22"/>
               </w:rPr>
-              <w:t>WBS 9.4</w:t>
+              <w:t xml:space="preserve"> tại phiên bản hoàn thiện nộp báo cáo*</w:t>
+            </w:r>
+          </w:p>
+        </w:tc>
+        <w:tc>
+          <w:tcPr>
+            <w:tcW w:type="dxa" w:w="1656"/>
+          </w:tcPr>
+          <w:p>
+            <w:pPr>
+              <w:spacing w:before="60" w:after="60"/>
+              <w:jc w:val="left"/>
+            </w:pPr>
+            <w:r/>
+            <w:r>
+              <w:rPr>
+                <w:rFonts w:ascii="Times New Roman" w:hAnsi="Times New Roman"/>
+                <w:sz w:val="22"/>
+              </w:rPr>
+              <w:t>Chuyển giao đồ án</w:t>
             </w:r>
           </w:p>
         </w:tc>
@@ -7700,7 +7714,7 @@
                 <w:b/>
                 <w:sz w:val="22"/>
               </w:rPr>
-              <w:t>Tag `v1.0-final`</w:t>
+              <w:t>447e6ca</w:t>
             </w:r>
           </w:p>
         </w:tc>
@@ -7719,7 +7733,7 @@
                 <w:rFonts w:ascii="Times New Roman" w:hAnsi="Times New Roman"/>
                 <w:sz w:val="22"/>
               </w:rPr>
-              <w:t>09/05/2026</w:t>
+              <w:t>10/05/2026</w:t>
             </w:r>
           </w:p>
         </w:tc>
@@ -7773,43 +7787,29 @@
             <w:r/>
             <w:r>
               <w:rPr>
+                <w:rFonts w:ascii="Consolas" w:hAnsi="Consolas"/>
+                <w:sz w:val="20"/>
+              </w:rPr>
+              <w:t>chore: synchronize repository with final local workspace state</w:t>
+            </w:r>
+          </w:p>
+        </w:tc>
+        <w:tc>
+          <w:tcPr>
+            <w:tcW w:type="dxa" w:w="1656"/>
+          </w:tcPr>
+          <w:p>
+            <w:pPr>
+              <w:spacing w:before="60" w:after="60"/>
+              <w:jc w:val="left"/>
+            </w:pPr>
+            <w:r/>
+            <w:r>
+              <w:rPr>
                 <w:rFonts w:ascii="Times New Roman" w:hAnsi="Times New Roman"/>
                 <w:sz w:val="22"/>
               </w:rPr>
-              <w:t xml:space="preserve">*Gắn thẻ tag </w:t>
-            </w:r>
-            <w:r>
-              <w:rPr>
-                <w:rFonts w:ascii="Consolas" w:hAnsi="Consolas"/>
-                <w:sz w:val="20"/>
-              </w:rPr>
-              <w:t>v1.0-final</w:t>
-            </w:r>
-            <w:r>
-              <w:rPr>
-                <w:rFonts w:ascii="Times New Roman" w:hAnsi="Times New Roman"/>
-                <w:sz w:val="22"/>
-              </w:rPr>
-              <w:t xml:space="preserve"> tại phiên bản hoàn thiện nộp báo cáo*</w:t>
-            </w:r>
-          </w:p>
-        </w:tc>
-        <w:tc>
-          <w:tcPr>
-            <w:tcW w:type="dxa" w:w="1656"/>
-          </w:tcPr>
-          <w:p>
-            <w:pPr>
-              <w:spacing w:before="60" w:after="60"/>
-              <w:jc w:val="left"/>
-            </w:pPr>
-            <w:r/>
-            <w:r>
-              <w:rPr>
-                <w:rFonts w:ascii="Times New Roman" w:hAnsi="Times New Roman"/>
-                <w:sz w:val="22"/>
-              </w:rPr>
-              <w:t>Chuyển giao đồ án</w:t>
+              <w:t>WBS 9.1</w:t>
             </w:r>
           </w:p>
         </w:tc>
@@ -7831,124 +7831,7 @@
                 <w:b/>
                 <w:sz w:val="22"/>
               </w:rPr>
-              <w:t>9179967</w:t>
-            </w:r>
-          </w:p>
-        </w:tc>
-        <w:tc>
-          <w:tcPr>
-            <w:tcW w:type="dxa" w:w="1656"/>
-          </w:tcPr>
-          <w:p>
-            <w:pPr>
-              <w:spacing w:before="60" w:after="60"/>
-              <w:jc w:val="left"/>
-            </w:pPr>
-            <w:r/>
-            <w:r>
-              <w:rPr>
-                <w:rFonts w:ascii="Times New Roman" w:hAnsi="Times New Roman"/>
-                <w:sz w:val="22"/>
-              </w:rPr>
-              <w:t>10/05/2026</w:t>
-            </w:r>
-          </w:p>
-        </w:tc>
-        <w:tc>
-          <w:tcPr>
-            <w:tcW w:type="dxa" w:w="1656"/>
-          </w:tcPr>
-          <w:p>
-            <w:pPr>
-              <w:spacing w:before="60" w:after="60"/>
-              <w:jc w:val="left"/>
-            </w:pPr>
-            <w:r/>
-            <w:r>
-              <w:rPr>
-                <w:rFonts w:ascii="Consolas" w:hAnsi="Consolas"/>
-                <w:sz w:val="20"/>
-              </w:rPr>
-              <w:t>main</w:t>
-            </w:r>
-          </w:p>
-        </w:tc>
-        <w:tc>
-          <w:tcPr>
-            <w:tcW w:type="dxa" w:w="1656"/>
-          </w:tcPr>
-          <w:p>
-            <w:pPr>
-              <w:spacing w:before="60" w:after="60"/>
-              <w:jc w:val="left"/>
-            </w:pPr>
-            <w:r/>
-            <w:r>
-              <w:rPr>
-                <w:rFonts w:ascii="Times New Roman" w:hAnsi="Times New Roman"/>
-                <w:sz w:val="22"/>
-              </w:rPr>
-              <w:t>MinhTris</w:t>
-            </w:r>
-          </w:p>
-        </w:tc>
-        <w:tc>
-          <w:tcPr>
-            <w:tcW w:type="dxa" w:w="1656"/>
-          </w:tcPr>
-          <w:p>
-            <w:pPr>
-              <w:spacing w:before="60" w:after="60"/>
-              <w:jc w:val="left"/>
-            </w:pPr>
-            <w:r/>
-            <w:r>
-              <w:rPr>
-                <w:rFonts w:ascii="Consolas" w:hAnsi="Consolas"/>
-                <w:sz w:val="20"/>
-              </w:rPr>
-              <w:t>chore: synchronize repository with final local workspace state</w:t>
-            </w:r>
-          </w:p>
-        </w:tc>
-        <w:tc>
-          <w:tcPr>
-            <w:tcW w:type="dxa" w:w="1656"/>
-          </w:tcPr>
-          <w:p>
-            <w:pPr>
-              <w:spacing w:before="60" w:after="60"/>
-              <w:jc w:val="left"/>
-            </w:pPr>
-            <w:r/>
-            <w:r>
-              <w:rPr>
-                <w:rFonts w:ascii="Times New Roman" w:hAnsi="Times New Roman"/>
-                <w:sz w:val="22"/>
-              </w:rPr>
-              <w:t>WBS 9.1</w:t>
-            </w:r>
-          </w:p>
-        </w:tc>
-      </w:tr>
-      <w:tr>
-        <w:tc>
-          <w:tcPr>
-            <w:tcW w:type="dxa" w:w="1656"/>
-          </w:tcPr>
-          <w:p>
-            <w:pPr>
-              <w:spacing w:before="60" w:after="60"/>
-              <w:jc w:val="left"/>
-            </w:pPr>
-            <w:r/>
-            <w:r>
-              <w:rPr>
-                <w:rFonts w:ascii="Times New Roman" w:hAnsi="Times New Roman"/>
-                <w:b/>
-                <w:sz w:val="22"/>
-              </w:rPr>
-              <w:t>d39c383</w:t>
+              <w:t>0a79b55</w:t>
             </w:r>
           </w:p>
         </w:tc>

</xml_diff>

<commit_message>
docs(report): update commit hashes for readme commits on branches
</commit_message>
<xml_diff>
--- a/Chuong07_Git.docx
+++ b/Chuong07_Git.docx
@@ -1616,7 +1616,7 @@
                 <w:b/>
                 <w:sz w:val="22"/>
               </w:rPr>
-              <w:t>03fdb53</w:t>
+              <w:t>f55a5d7</w:t>
             </w:r>
           </w:p>
         </w:tc>
@@ -1733,7 +1733,7 @@
                 <w:b/>
                 <w:sz w:val="22"/>
               </w:rPr>
-              <w:t>d08c763</w:t>
+              <w:t>7f435dd</w:t>
             </w:r>
           </w:p>
         </w:tc>
@@ -1850,7 +1850,7 @@
                 <w:b/>
                 <w:sz w:val="22"/>
               </w:rPr>
-              <w:t>a9a4486</w:t>
+              <w:t>78f9524</w:t>
             </w:r>
           </w:p>
         </w:tc>
@@ -1967,7 +1967,7 @@
                 <w:b/>
                 <w:sz w:val="22"/>
               </w:rPr>
-              <w:t>b31d4c1</w:t>
+              <w:t>49a33d5</w:t>
             </w:r>
           </w:p>
         </w:tc>
@@ -2084,7 +2084,7 @@
                 <w:b/>
                 <w:sz w:val="22"/>
               </w:rPr>
-              <w:t>3fd293b</w:t>
+              <w:t>687d416</w:t>
             </w:r>
           </w:p>
         </w:tc>
@@ -2201,7 +2201,7 @@
                 <w:b/>
                 <w:sz w:val="22"/>
               </w:rPr>
-              <w:t>7f738ed</w:t>
+              <w:t>f23fcbd</w:t>
             </w:r>
           </w:p>
         </w:tc>
@@ -2318,7 +2318,7 @@
                 <w:b/>
                 <w:sz w:val="22"/>
               </w:rPr>
-              <w:t>b31d4c1</w:t>
+              <w:t>49a33d5</w:t>
             </w:r>
           </w:p>
         </w:tc>
@@ -2435,7 +2435,7 @@
                 <w:b/>
                 <w:sz w:val="22"/>
               </w:rPr>
-              <w:t>a3b9ff9</w:t>
+              <w:t>8c02494</w:t>
             </w:r>
           </w:p>
         </w:tc>
@@ -2552,7 +2552,7 @@
                 <w:b/>
                 <w:sz w:val="22"/>
               </w:rPr>
-              <w:t>31ac545</w:t>
+              <w:t>d68d084</w:t>
             </w:r>
           </w:p>
         </w:tc>
@@ -2669,7 +2669,7 @@
                 <w:b/>
                 <w:sz w:val="22"/>
               </w:rPr>
-              <w:t>14f85d7</w:t>
+              <w:t>4564911</w:t>
             </w:r>
           </w:p>
         </w:tc>
@@ -2786,7 +2786,7 @@
                 <w:b/>
                 <w:sz w:val="22"/>
               </w:rPr>
-              <w:t>b31d4c1</w:t>
+              <w:t>49a33d5</w:t>
             </w:r>
           </w:p>
         </w:tc>
@@ -2903,7 +2903,7 @@
                 <w:b/>
                 <w:sz w:val="22"/>
               </w:rPr>
-              <w:t>e577dd8</w:t>
+              <w:t>8f3a7ce</w:t>
             </w:r>
           </w:p>
         </w:tc>
@@ -3020,7 +3020,7 @@
                 <w:b/>
                 <w:sz w:val="22"/>
               </w:rPr>
-              <w:t>93f1f21</w:t>
+              <w:t>a26f4a7</w:t>
             </w:r>
           </w:p>
         </w:tc>
@@ -3137,7 +3137,7 @@
                 <w:b/>
                 <w:sz w:val="22"/>
               </w:rPr>
-              <w:t>05a3d23</w:t>
+              <w:t>05f6f6f</w:t>
             </w:r>
           </w:p>
         </w:tc>
@@ -3371,7 +3371,7 @@
                 <w:b/>
                 <w:sz w:val="22"/>
               </w:rPr>
-              <w:t>016136f</w:t>
+              <w:t>b73aa1e</w:t>
             </w:r>
           </w:p>
         </w:tc>
@@ -3488,7 +3488,7 @@
                 <w:b/>
                 <w:sz w:val="22"/>
               </w:rPr>
-              <w:t>484541d</w:t>
+              <w:t>83875f1</w:t>
             </w:r>
           </w:p>
         </w:tc>
@@ -3605,7 +3605,7 @@
                 <w:b/>
                 <w:sz w:val="22"/>
               </w:rPr>
-              <w:t>f17d977</w:t>
+              <w:t>e5c3b13</w:t>
             </w:r>
           </w:p>
         </w:tc>
@@ -3722,7 +3722,7 @@
                 <w:b/>
                 <w:sz w:val="22"/>
               </w:rPr>
-              <w:t>6eb3dc0</w:t>
+              <w:t>2009034</w:t>
             </w:r>
           </w:p>
         </w:tc>
@@ -3839,7 +3839,7 @@
                 <w:b/>
                 <w:sz w:val="22"/>
               </w:rPr>
-              <w:t>57f1fe3</w:t>
+              <w:t>8e66446</w:t>
             </w:r>
           </w:p>
         </w:tc>
@@ -3956,7 +3956,7 @@
                 <w:b/>
                 <w:sz w:val="22"/>
               </w:rPr>
-              <w:t>f17d977</w:t>
+              <w:t>e5c3b13</w:t>
             </w:r>
           </w:p>
         </w:tc>
@@ -4073,7 +4073,7 @@
                 <w:b/>
                 <w:sz w:val="22"/>
               </w:rPr>
-              <w:t>51fa9a5</w:t>
+              <w:t>f442a61</w:t>
             </w:r>
           </w:p>
         </w:tc>
@@ -4190,7 +4190,7 @@
                 <w:b/>
                 <w:sz w:val="22"/>
               </w:rPr>
-              <w:t>f7fd939</w:t>
+              <w:t>7a67c59</w:t>
             </w:r>
           </w:p>
         </w:tc>
@@ -4307,7 +4307,7 @@
                 <w:b/>
                 <w:sz w:val="22"/>
               </w:rPr>
-              <w:t>9a9315d</w:t>
+              <w:t>2912413</w:t>
             </w:r>
           </w:p>
         </w:tc>
@@ -4424,7 +4424,7 @@
                 <w:b/>
                 <w:sz w:val="22"/>
               </w:rPr>
-              <w:t>5e18609</w:t>
+              <w:t>f94d2c0</w:t>
             </w:r>
           </w:p>
         </w:tc>
@@ -4541,7 +4541,7 @@
                 <w:b/>
                 <w:sz w:val="22"/>
               </w:rPr>
-              <w:t>d8093d1</w:t>
+              <w:t>89eb1d8</w:t>
             </w:r>
           </w:p>
         </w:tc>
@@ -4658,7 +4658,7 @@
                 <w:b/>
                 <w:sz w:val="22"/>
               </w:rPr>
-              <w:t>fe660fa</w:t>
+              <w:t>46c2c94</w:t>
             </w:r>
           </w:p>
         </w:tc>
@@ -4775,7 +4775,7 @@
                 <w:b/>
                 <w:sz w:val="22"/>
               </w:rPr>
-              <w:t>a66d2c7</w:t>
+              <w:t>6c58ef8</w:t>
             </w:r>
           </w:p>
         </w:tc>
@@ -4892,7 +4892,7 @@
                 <w:b/>
                 <w:sz w:val="22"/>
               </w:rPr>
-              <w:t>5011f76</w:t>
+              <w:t>761ced7</w:t>
             </w:r>
           </w:p>
         </w:tc>
@@ -5009,7 +5009,7 @@
                 <w:b/>
                 <w:sz w:val="22"/>
               </w:rPr>
-              <w:t>d8e9e15</w:t>
+              <w:t>b38bf65</w:t>
             </w:r>
           </w:p>
         </w:tc>
@@ -5126,7 +5126,7 @@
                 <w:b/>
                 <w:sz w:val="22"/>
               </w:rPr>
-              <w:t>6beb119</w:t>
+              <w:t>3c034e6</w:t>
             </w:r>
           </w:p>
         </w:tc>
@@ -5243,7 +5243,7 @@
                 <w:b/>
                 <w:sz w:val="22"/>
               </w:rPr>
-              <w:t>7ed0bec</w:t>
+              <w:t>70ac140</w:t>
             </w:r>
           </w:p>
         </w:tc>
@@ -5360,7 +5360,7 @@
                 <w:b/>
                 <w:sz w:val="22"/>
               </w:rPr>
-              <w:t>e61e54b</w:t>
+              <w:t>dbcaae4</w:t>
             </w:r>
           </w:p>
         </w:tc>
@@ -5477,7 +5477,7 @@
                 <w:b/>
                 <w:sz w:val="22"/>
               </w:rPr>
-              <w:t>317a8e5</w:t>
+              <w:t>4008116</w:t>
             </w:r>
           </w:p>
         </w:tc>
@@ -5594,7 +5594,7 @@
                 <w:b/>
                 <w:sz w:val="22"/>
               </w:rPr>
-              <w:t>dcf9653</w:t>
+              <w:t>02ac3b0</w:t>
             </w:r>
           </w:p>
         </w:tc>
@@ -5711,7 +5711,7 @@
                 <w:b/>
                 <w:sz w:val="22"/>
               </w:rPr>
-              <w:t>ddc1a5b</w:t>
+              <w:t>06e6ee6</w:t>
             </w:r>
           </w:p>
         </w:tc>
@@ -5828,7 +5828,7 @@
                 <w:b/>
                 <w:sz w:val="22"/>
               </w:rPr>
-              <w:t>2cff247</w:t>
+              <w:t>a6fa03e</w:t>
             </w:r>
           </w:p>
         </w:tc>
@@ -5945,7 +5945,7 @@
                 <w:b/>
                 <w:sz w:val="22"/>
               </w:rPr>
-              <w:t>a4e9a26</w:t>
+              <w:t>b75d943</w:t>
             </w:r>
           </w:p>
         </w:tc>
@@ -6062,7 +6062,7 @@
                 <w:b/>
                 <w:sz w:val="22"/>
               </w:rPr>
-              <w:t>50d8795</w:t>
+              <w:t>93cb087</w:t>
             </w:r>
           </w:p>
         </w:tc>
@@ -6179,7 +6179,7 @@
                 <w:b/>
                 <w:sz w:val="22"/>
               </w:rPr>
-              <w:t>b45dffe</w:t>
+              <w:t>c164f10</w:t>
             </w:r>
           </w:p>
         </w:tc>
@@ -6296,7 +6296,7 @@
                 <w:b/>
                 <w:sz w:val="22"/>
               </w:rPr>
-              <w:t>a84a49b</w:t>
+              <w:t>175a09d</w:t>
             </w:r>
           </w:p>
         </w:tc>
@@ -6413,7 +6413,7 @@
                 <w:b/>
                 <w:sz w:val="22"/>
               </w:rPr>
-              <w:t>1e01ab7</w:t>
+              <w:t>83a0122</w:t>
             </w:r>
           </w:p>
         </w:tc>
@@ -6530,7 +6530,7 @@
                 <w:b/>
                 <w:sz w:val="22"/>
               </w:rPr>
-              <w:t>60238c2</w:t>
+              <w:t>0070517</w:t>
             </w:r>
           </w:p>
         </w:tc>
@@ -6647,7 +6647,7 @@
                 <w:b/>
                 <w:sz w:val="22"/>
               </w:rPr>
-              <w:t>ee71947</w:t>
+              <w:t>dd9d794</w:t>
             </w:r>
           </w:p>
         </w:tc>
@@ -6764,7 +6764,7 @@
                 <w:b/>
                 <w:sz w:val="22"/>
               </w:rPr>
-              <w:t>738a9ab</w:t>
+              <w:t>84d66fe</w:t>
             </w:r>
           </w:p>
         </w:tc>
@@ -6881,7 +6881,7 @@
                 <w:b/>
                 <w:sz w:val="22"/>
               </w:rPr>
-              <w:t>d27f988</w:t>
+              <w:t>273d44f</w:t>
             </w:r>
           </w:p>
         </w:tc>
@@ -6998,7 +6998,7 @@
                 <w:b/>
                 <w:sz w:val="22"/>
               </w:rPr>
-              <w:t>d5bea6a</w:t>
+              <w:t>3f26f96</w:t>
             </w:r>
           </w:p>
         </w:tc>
@@ -7115,7 +7115,7 @@
                 <w:b/>
                 <w:sz w:val="22"/>
               </w:rPr>
-              <w:t>f8356e2</w:t>
+              <w:t>393b5ca</w:t>
             </w:r>
           </w:p>
         </w:tc>
@@ -7232,7 +7232,7 @@
                 <w:b/>
                 <w:sz w:val="22"/>
               </w:rPr>
-              <w:t>d25059f</w:t>
+              <w:t>31c34fd</w:t>
             </w:r>
           </w:p>
         </w:tc>
@@ -7349,7 +7349,7 @@
                 <w:b/>
                 <w:sz w:val="22"/>
               </w:rPr>
-              <w:t>d35e22d</w:t>
+              <w:t>0abdb57</w:t>
             </w:r>
           </w:p>
         </w:tc>
@@ -7466,7 +7466,7 @@
                 <w:b/>
                 <w:sz w:val="22"/>
               </w:rPr>
-              <w:t>85f954c</w:t>
+              <w:t>3c89475</w:t>
             </w:r>
           </w:p>
         </w:tc>
@@ -7714,7 +7714,7 @@
                 <w:b/>
                 <w:sz w:val="22"/>
               </w:rPr>
-              <w:t>447e6ca</w:t>
+              <w:t>b9e4b49</w:t>
             </w:r>
           </w:p>
         </w:tc>
@@ -7831,7 +7831,7 @@
                 <w:b/>
                 <w:sz w:val="22"/>
               </w:rPr>
-              <w:t>0a79b55</w:t>
+              <w:t>2bb6cee</w:t>
             </w:r>
           </w:p>
         </w:tc>

</xml_diff>